<commit_message>
Switch CTRL + ESCAPE questions from ICT to general knowledge
Sectors are now Science Lab, Time Vault (Philippine history), Fun Zone
(everyday life) and World Map (geography), with Fact or Myth and
sari-sari receipt puzzles replacing the phishing and Excel challenges.
Documentation, flowchart and screenshots updated to match.

Co-Authored-By: Claude Opus 5.5 <noreply@anthropic.com>
Claude-Session: https://claude.ai/code/session_015Anyb9rTrTM848P791HGtW
</commit_message>
<xml_diff>
--- a/gamecraft-ctrl-escape/CTRL-ESCAPE_Game_Documentation.docx
+++ b/gamecraft-ctrl-escape/CTRL-ESCAPE_Game_Documentation.docx
@@ -538,7 +538,7 @@
         <w:t xml:space="preserve">Kai</w:t>
       </w:r>
       <w:r>
-        <w:t xml:space="preserve">, a Senior High School student who gets pulled inside an infected computer after clicking a fake "You won a FREE phone!" pop-up. To escape, Kai must cross four computer sectors, answer Empowerment Technologies challenges, protect three shields, and collect four Code Fragments that unlock the ESC Gate guarded by a virus named </w:t>
+        <w:t xml:space="preserve">, a Senior High School student who gets pulled inside an infected computer after clicking a fake "You won a FREE phone!" pop-up. To escape, Kai must cross four computer sectors, answer general-knowledge challenges about science, history, everyday life, and geography, protect three shields, and collect four Code Fragments that unlock the ESC Gate guarded by a virus named </w:t>
       </w:r>
       <w:r>
         <w:rPr>
@@ -562,7 +562,7 @@
         </w:rPr>
         <w:t xml:space="preserve">Play the game: </w:t>
       </w:r>
-      <w:hyperlink w:history="1" r:id="rIdtqoreyahbqecf7hgib7jf">
+      <w:hyperlink w:history="1" r:id="rIddl9pepgkaomm8c5pdh8td">
         <w:r>
           <w:rPr>
             <w:rStyle w:val="Hyperlink"/>
@@ -920,7 +920,7 @@
                 <w:b w:val="false"/>
                 <w:bCs w:val="false"/>
               </w:rPr>
-              <w:t xml:space="preserve">Senior High School students taking Empowerment Technologies, and anyone learning to use computers safely</w:t>
+              <w:t xml:space="preserve">Senior High School students and anyone who enjoys trivia. No special knowledge is needed: the questions cover things most people learn in school and everyday life.</w:t>
             </w:r>
           </w:p>
         </w:tc>
@@ -1006,7 +1006,7 @@
                 <w:bCs/>
                 <w:color w:val="1A2353"/>
               </w:rPr>
-              <w:t xml:space="preserve">Learning Content</w:t>
+              <w:t xml:space="preserve">Game Content</w:t>
             </w:r>
           </w:p>
         </w:tc>
@@ -1030,7 +1030,7 @@
                 <w:b w:val="false"/>
                 <w:bCs w:val="false"/>
               </w:rPr>
-              <w:t xml:space="preserve">ICT and the Web; online safety, security, and netiquette; productivity tools; online search, research, and intellectual property</w:t>
+              <w:t xml:space="preserve">General knowledge: science and nature, Philippine history, everyday life (food, sports, and money), and geography</w:t>
             </w:r>
           </w:p>
         </w:tc>
@@ -1086,7 +1086,7 @@
                 <w:b w:val="false"/>
                 <w:bCs w:val="false"/>
               </w:rPr>
-              <w:t xml:space="preserve">133 slides, 560 hyperlinks, 5 game areas, 14 challenges, 3 endings (win with 1, 2, or 3 stars) plus Game Over</w:t>
+              <w:t xml:space="preserve">133 slides, 548 hyperlinks, 5 game areas, 14 challenges, 3 endings (win with 1, 2, or 3 stars) plus Game Over</w:t>
             </w:r>
           </w:p>
         </w:tc>
@@ -2372,7 +2372,7 @@
         <w:spacing w:after="120" w:line="288"/>
       </w:pPr>
       <w:r>
-        <w:t xml:space="preserve">The game takes place inside Kai's computer, shown as a glowing digital world with a neon grid floor. Each area has its own color so players always know where they are: cyan for the Web Gateway, orange for the Firewall Fortress, violet for the Office Archives, green for the Search Maze, and magenta for NULL's Core.</w:t>
+        <w:t xml:space="preserve">The game takes place inside Kai's computer, shown as a glowing digital world with a neon grid floor. Each area has its own color so players always know where they are: cyan for the Science Lab, orange for the Time Vault, violet for the Fun Zone, green for the World Map, and magenta for NULL's Core.</w:t>
       </w:r>
     </w:p>
     <w:p>
@@ -2453,7 +2453,7 @@
         <w:spacing w:after="120" w:line="288"/>
       </w:pPr>
       <w:r>
-        <w:t xml:space="preserve">The adventure is divided into four sectors and a final area. Each one covers a different Empowerment Technologies topic and ends with a reward.</w:t>
+        <w:t xml:space="preserve">The adventure is divided into four sectors and a final area. Each one covers a different general-knowledge topic and ends with a reward. The questions were chosen so that any student can play, not just ICT experts.</w:t>
       </w:r>
     </w:p>
     <w:tbl>
@@ -2527,7 +2527,7 @@
                 <w:bCs/>
                 <w:color w:val="FFFFFF"/>
               </w:rPr>
-              <w:t xml:space="preserve">E-Tech Topic</w:t>
+              <w:t xml:space="preserve">Topic</w:t>
             </w:r>
           </w:p>
         </w:tc>
@@ -2609,7 +2609,7 @@
                 <w:bCs/>
                 <w:color w:val="1A2353"/>
               </w:rPr>
-              <w:t xml:space="preserve">Sector 1: The Web Gateway</w:t>
+              <w:t xml:space="preserve">Sector 1: The Science Lab</w:t>
             </w:r>
           </w:p>
         </w:tc>
@@ -2633,7 +2633,7 @@
                 <w:b w:val="false"/>
                 <w:bCs w:val="false"/>
               </w:rPr>
-              <w:t xml:space="preserve">ICT and the World Wide Web (Web 1.0, 2.0, 3.0; ICT trends; Web 2.0 features)</w:t>
+              <w:t xml:space="preserve">Science and Nature</w:t>
             </w:r>
           </w:p>
         </w:tc>
@@ -2657,7 +2657,7 @@
                 <w:b w:val="false"/>
                 <w:bCs w:val="false"/>
               </w:rPr>
-              <w:t xml:space="preserve">3 multiple-choice questions</w:t>
+              <w:t xml:space="preserve">2 multiple-choice questions + 1 Fact or Myth</w:t>
             </w:r>
           </w:p>
         </w:tc>
@@ -2712,7 +2712,7 @@
                 <w:bCs/>
                 <w:color w:val="1A2353"/>
               </w:rPr>
-              <w:t xml:space="preserve">Sector 2: The Firewall Fortress</w:t>
+              <w:t xml:space="preserve">Sector 2: The Time Vault</w:t>
             </w:r>
           </w:p>
         </w:tc>
@@ -2737,7 +2737,7 @@
                 <w:b w:val="false"/>
                 <w:bCs w:val="false"/>
               </w:rPr>
-              <w:t xml:space="preserve">Online safety, security, and netiquette</w:t>
+              <w:t xml:space="preserve">Philippine History</w:t>
             </w:r>
           </w:p>
         </w:tc>
@@ -2762,7 +2762,7 @@
                 <w:b w:val="false"/>
                 <w:bCs w:val="false"/>
               </w:rPr>
-              <w:t xml:space="preserve">Legit-or-Phishing email check, password strength, malware type</w:t>
+              <w:t xml:space="preserve">2 multiple-choice questions + 1 Fact or Myth</w:t>
             </w:r>
           </w:p>
         </w:tc>
@@ -2817,7 +2817,7 @@
                 <w:bCs/>
                 <w:color w:val="1A2353"/>
               </w:rPr>
-              <w:t xml:space="preserve">Sector 3: The Office Archives</w:t>
+              <w:t xml:space="preserve">Sector 3: The Fun Zone</w:t>
             </w:r>
           </w:p>
         </w:tc>
@@ -2841,7 +2841,7 @@
                 <w:b w:val="false"/>
                 <w:bCs w:val="false"/>
               </w:rPr>
-              <w:t xml:space="preserve">Productivity tools (Word, Excel, PowerPoint)</w:t>
+              <w:t xml:space="preserve">Everyday Life: Food, Sports, and Money</w:t>
             </w:r>
           </w:p>
         </w:tc>
@@ -2865,7 +2865,7 @@
                 <w:b w:val="false"/>
                 <w:bCs w:val="false"/>
               </w:rPr>
-              <w:t xml:space="preserve">Mail Merge, Excel formula puzzle, PowerPoint hyperlinks</w:t>
+              <w:t xml:space="preserve">2 multiple-choice questions + 1 sari-sari store receipt puzzle</w:t>
             </w:r>
           </w:p>
         </w:tc>
@@ -2920,7 +2920,7 @@
                 <w:bCs/>
                 <w:color w:val="1A2353"/>
               </w:rPr>
-              <w:t xml:space="preserve">Sector 4: The Search Maze</w:t>
+              <w:t xml:space="preserve">Sector 4: The World Map</w:t>
             </w:r>
           </w:p>
         </w:tc>
@@ -2945,7 +2945,7 @@
                 <w:b w:val="false"/>
                 <w:bCs w:val="false"/>
               </w:rPr>
-              <w:t xml:space="preserve">Online search, research, and intellectual property</w:t>
+              <w:t xml:space="preserve">Geography of the Philippines and the World</w:t>
             </w:r>
           </w:p>
         </w:tc>
@@ -2970,7 +2970,7 @@
                 <w:b w:val="false"/>
                 <w:bCs w:val="false"/>
               </w:rPr>
-              <w:t xml:space="preserve">Choose-a-door search puzzle, reliable sources, copyright</w:t>
+              <w:t xml:space="preserve">1 choose-a-door puzzle + 2 multiple-choice questions</w:t>
             </w:r>
           </w:p>
         </w:tc>
@@ -3589,7 +3589,7 @@
                 <w:bCs/>
                 <w:color w:val="1A2353"/>
               </w:rPr>
-              <w:t xml:space="preserve">Legit or Phishing?</w:t>
+              <w:t xml:space="preserve">Fact or Myth?</w:t>
             </w:r>
           </w:p>
         </w:tc>
@@ -3614,7 +3614,7 @@
                 <w:b w:val="false"/>
                 <w:bCs w:val="false"/>
               </w:rPr>
-              <w:t xml:space="preserve">Inspect a suspicious email, then decide if it is LEGIT or PHISHING.</w:t>
+              <w:t xml:space="preserve">Read a statement from a corrupted file, then decide if it is a FACT or a MYTH.</w:t>
             </w:r>
           </w:p>
         </w:tc>
@@ -3639,7 +3639,7 @@
                 <w:b w:val="false"/>
                 <w:bCs w:val="false"/>
               </w:rPr>
-              <w:t xml:space="preserve">Sector 2</w:t>
+              <w:t xml:space="preserve">Sectors 1 and 2</w:t>
             </w:r>
           </w:p>
         </w:tc>
@@ -3669,7 +3669,7 @@
                 <w:bCs/>
                 <w:color w:val="1A2353"/>
               </w:rPr>
-              <w:t xml:space="preserve">Spreadsheet Puzzle</w:t>
+              <w:t xml:space="preserve">Receipt Puzzle</w:t>
             </w:r>
           </w:p>
         </w:tc>
@@ -3693,7 +3693,7 @@
                 <w:b w:val="false"/>
                 <w:bCs w:val="false"/>
               </w:rPr>
-              <w:t xml:space="preserve">Read a mini Excel sheet and pick the formula that opens the vault.</w:t>
+              <w:t xml:space="preserve">Read a sari-sari store receipt and work out the total.</w:t>
             </w:r>
           </w:p>
         </w:tc>
@@ -3773,7 +3773,7 @@
                 <w:b w:val="false"/>
                 <w:bCs w:val="false"/>
               </w:rPr>
-              <w:t xml:space="preserve">Four doors, each labeled with a search query. Open the one that leads the right way.</w:t>
+              <w:t xml:space="preserve">Four doors, each labeled with a city. Open the one that leads the right way.</w:t>
             </w:r>
           </w:p>
         </w:tc>
@@ -4237,7 +4237,7 @@
                 <w:b w:val="false"/>
                 <w:bCs w:val="false"/>
               </w:rPr>
-              <w:t xml:space="preserve">FIREWALL HERO</w:t>
+              <w:t xml:space="preserve">GLITCH BUSTER</w:t>
             </w:r>
           </w:p>
         </w:tc>
@@ -6799,7 +6799,7 @@
                 <w:bCs/>
                 <w:color w:val="1A2353"/>
               </w:rPr>
-              <w:t xml:space="preserve">Sector 1 - Web Gateway</w:t>
+              <w:t xml:space="preserve">Sector 1 - Science Lab</w:t>
             </w:r>
           </w:p>
         </w:tc>
@@ -6902,7 +6902,7 @@
                 <w:bCs/>
                 <w:color w:val="1A2353"/>
               </w:rPr>
-              <w:t xml:space="preserve">Sector 2 - Firewall Fortress</w:t>
+              <w:t xml:space="preserve">Sector 2 - Time Vault</w:t>
             </w:r>
           </w:p>
         </w:tc>
@@ -7007,7 +7007,7 @@
                 <w:bCs/>
                 <w:color w:val="1A2353"/>
               </w:rPr>
-              <w:t xml:space="preserve">Sector 3 - Office Archives</w:t>
+              <w:t xml:space="preserve">Sector 3 - Fun Zone</w:t>
             </w:r>
           </w:p>
         </w:tc>
@@ -7110,7 +7110,7 @@
                 <w:bCs/>
                 <w:color w:val="1A2353"/>
               </w:rPr>
-              <w:t xml:space="preserve">Sector 4 - Search Maze</w:t>
+              <w:t xml:space="preserve">Sector 4 - World Map</w:t>
             </w:r>
           </w:p>
         </w:tc>
@@ -7465,7 +7465,7 @@
         <w:pStyle w:val="Heading2"/>
       </w:pPr>
       <w:r>
-        <w:t xml:space="preserve">Sector 1: The Web Gateway</w:t>
+        <w:t xml:space="preserve">Sector 1: The Science Lab</w:t>
       </w:r>
     </w:p>
     <w:p>
@@ -7481,7 +7481,7 @@
         <w:t xml:space="preserve">Topic:</w:t>
       </w:r>
       <w:r>
-        <w:t xml:space="preserve"> ICT and the World Wide Web   |   </w:t>
+        <w:t xml:space="preserve"> Science and Nature   |   </w:t>
       </w:r>
       <w:r>
         <w:rPr>
@@ -7666,39 +7666,39 @@
                 <w:b/>
                 <w:bCs/>
               </w:rPr>
-              <w:t xml:space="preserve">Which version of the Web lets users CREATE and SHARE content, like posting videos, commenting, and writing blogs?</w:t>
-            </w:r>
-          </w:p>
-          <w:p>
-            <w:pPr>
-              <w:spacing w:after="40" w:line="264"/>
-            </w:pPr>
-            <w:r>
-              <w:t xml:space="preserve">A. Web 1.0</w:t>
-            </w:r>
-          </w:p>
-          <w:p>
-            <w:pPr>
-              <w:spacing w:after="40" w:line="264"/>
-            </w:pPr>
-            <w:r>
-              <w:t xml:space="preserve">B. Web 2.0</w:t>
-            </w:r>
-          </w:p>
-          <w:p>
-            <w:pPr>
-              <w:spacing w:after="40" w:line="264"/>
-            </w:pPr>
-            <w:r>
-              <w:t xml:space="preserve">C. Web 3.0</w:t>
-            </w:r>
-          </w:p>
-          <w:p>
-            <w:pPr>
-              <w:spacing w:after="40" w:line="264"/>
-            </w:pPr>
-            <w:r>
-              <w:t xml:space="preserve">D. The Dark Web</w:t>
+              <w:t xml:space="preserve">Which planet is known as the 'Red Planet'?</w:t>
+            </w:r>
+          </w:p>
+          <w:p>
+            <w:pPr>
+              <w:spacing w:after="40" w:line="264"/>
+            </w:pPr>
+            <w:r>
+              <w:t xml:space="preserve">A. Venus</w:t>
+            </w:r>
+          </w:p>
+          <w:p>
+            <w:pPr>
+              <w:spacing w:after="40" w:line="264"/>
+            </w:pPr>
+            <w:r>
+              <w:t xml:space="preserve">B. Mars</w:t>
+            </w:r>
+          </w:p>
+          <w:p>
+            <w:pPr>
+              <w:spacing w:after="40" w:line="264"/>
+            </w:pPr>
+            <w:r>
+              <w:t xml:space="preserve">C. Jupiter</w:t>
+            </w:r>
+          </w:p>
+          <w:p>
+            <w:pPr>
+              <w:spacing w:after="40" w:line="264"/>
+            </w:pPr>
+            <w:r>
+              <w:t xml:space="preserve">D. Saturn</w:t>
             </w:r>
           </w:p>
         </w:tc>
@@ -7725,7 +7725,7 @@
               <w:t xml:space="preserve">B.</w:t>
             </w:r>
             <w:r>
-              <w:t xml:space="preserve"> Web 2.0</w:t>
+              <w:t xml:space="preserve"> Mars</w:t>
             </w:r>
           </w:p>
         </w:tc>
@@ -7752,7 +7752,7 @@
               <w:t xml:space="preserve">Why:</w:t>
             </w:r>
             <w:r>
-              <w:t xml:space="preserve"> Web 2.0 is the dynamic, participatory web. Users don't just read pages: they post, comment, and share. Web 1.0 was static and read-only, while Web 3.0 is the 'semantic web' that understands and personalizes data.</w:t>
+              <w:t xml:space="preserve"> Mars looks red because its soil is full of iron oxide, the same stuff that makes rust. Venus is the hottest planet, while Jupiter and Saturn are giant gas planets.</w:t>
             </w:r>
           </w:p>
           <w:p>
@@ -7767,7 +7767,7 @@
               <w:t xml:space="preserve">Hint:</w:t>
             </w:r>
             <w:r>
-              <w:t xml:space="preserve"> Think of social media. Which version of the Web turned readers into creators?</w:t>
+              <w:t xml:space="preserve"> It's the fourth planet from the Sun, and robot rovers drive around on it.</w:t>
             </w:r>
           </w:p>
         </w:tc>
@@ -7818,39 +7818,31 @@
                 <w:b/>
                 <w:bCs/>
               </w:rPr>
-              <w:t xml:space="preserve">Kai's phone can call, chat, take photos, play music, and pay bills, all in ONE device. Which trend in ICT does this show?</w:t>
-            </w:r>
-          </w:p>
-          <w:p>
-            <w:pPr>
-              <w:spacing w:after="40" w:line="264"/>
-            </w:pPr>
-            <w:r>
-              <w:t xml:space="preserve">A. Assistive Media</w:t>
-            </w:r>
-          </w:p>
-          <w:p>
-            <w:pPr>
-              <w:spacing w:after="40" w:line="264"/>
-            </w:pPr>
-            <w:r>
-              <w:t xml:space="preserve">B. Technological Convergence</w:t>
-            </w:r>
-          </w:p>
-          <w:p>
-            <w:pPr>
-              <w:spacing w:after="40" w:line="264"/>
-            </w:pPr>
-            <w:r>
-              <w:t xml:space="preserve">C. Web 1.0</w:t>
-            </w:r>
-          </w:p>
-          <w:p>
-            <w:pPr>
-              <w:spacing w:after="40" w:line="264"/>
-            </w:pPr>
-            <w:r>
-              <w:t xml:space="preserve">D. Static Website</w:t>
+              <w:t xml:space="preserve">BYTE found this claim in a corrupted science file. Is it a FACT or a MYTH?</w:t>
+            </w:r>
+          </w:p>
+          <w:p>
+            <w:pPr>
+              <w:spacing w:after="40" w:line="264"/>
+            </w:pPr>
+            <w:r>
+              <w:t xml:space="preserve">Statement: "Lightning never strikes the same place twice."</w:t>
+            </w:r>
+          </w:p>
+          <w:p>
+            <w:pPr>
+              <w:spacing w:after="40" w:line="264"/>
+            </w:pPr>
+            <w:r>
+              <w:t xml:space="preserve">A. FACT</w:t>
+            </w:r>
+          </w:p>
+          <w:p>
+            <w:pPr>
+              <w:spacing w:after="40" w:line="264"/>
+            </w:pPr>
+            <w:r>
+              <w:t xml:space="preserve">B. MYTH</w:t>
             </w:r>
           </w:p>
         </w:tc>
@@ -7878,7 +7870,7 @@
               <w:t xml:space="preserve">B.</w:t>
             </w:r>
             <w:r>
-              <w:t xml:space="preserve"> Technological Convergence</w:t>
+              <w:t xml:space="preserve"> MYTH</w:t>
             </w:r>
           </w:p>
         </w:tc>
@@ -7906,7 +7898,7 @@
               <w:t xml:space="preserve">Why:</w:t>
             </w:r>
             <w:r>
-              <w:t xml:space="preserve"> Technological convergence is when different technologies merge to work together on one device or platform. A smartphone combines a phone, a camera, a music player, and a wallet.</w:t>
+              <w:t xml:space="preserve"> It's a myth! Lightning can strike the same place again and again, especially tall buildings, towers, and trees. Some skyscrapers are hit by lightning many times every year.</w:t>
             </w:r>
           </w:p>
           <w:p>
@@ -7921,7 +7913,7 @@
               <w:t xml:space="preserve">Hint:</w:t>
             </w:r>
             <w:r>
-              <w:t xml:space="preserve"> To 'converge' means to come together in one place.</w:t>
+              <w:t xml:space="preserve"> Think about what happens to very tall buildings during big thunderstorms.</w:t>
             </w:r>
           </w:p>
         </w:tc>
@@ -7970,39 +7962,39 @@
                 <w:b/>
                 <w:bCs/>
               </w:rPr>
-              <w:t xml:space="preserve">Users label posts with tags like #EmpowermentTech so content can be grouped and found. What is this Web 2.0 feature called?</w:t>
-            </w:r>
-          </w:p>
-          <w:p>
-            <w:pPr>
-              <w:spacing w:after="40" w:line="264"/>
-            </w:pPr>
-            <w:r>
-              <w:t xml:space="preserve">A. Folksonomy</w:t>
-            </w:r>
-          </w:p>
-          <w:p>
-            <w:pPr>
-              <w:spacing w:after="40" w:line="264"/>
-            </w:pPr>
-            <w:r>
-              <w:t xml:space="preserve">B. Long Tail</w:t>
-            </w:r>
-          </w:p>
-          <w:p>
-            <w:pPr>
-              <w:spacing w:after="40" w:line="264"/>
-            </w:pPr>
-            <w:r>
-              <w:t xml:space="preserve">C. Mass Participation</w:t>
-            </w:r>
-          </w:p>
-          <w:p>
-            <w:pPr>
-              <w:spacing w:after="40" w:line="264"/>
-            </w:pPr>
-            <w:r>
-              <w:t xml:space="preserve">D. Software as a Service</w:t>
+              <w:t xml:space="preserve">Plants make their own food using sunlight. Which gas do they take in from the air to do it?</w:t>
+            </w:r>
+          </w:p>
+          <w:p>
+            <w:pPr>
+              <w:spacing w:after="40" w:line="264"/>
+            </w:pPr>
+            <w:r>
+              <w:t xml:space="preserve">A. Oxygen</w:t>
+            </w:r>
+          </w:p>
+          <w:p>
+            <w:pPr>
+              <w:spacing w:after="40" w:line="264"/>
+            </w:pPr>
+            <w:r>
+              <w:t xml:space="preserve">B. Nitrogen</w:t>
+            </w:r>
+          </w:p>
+          <w:p>
+            <w:pPr>
+              <w:spacing w:after="40" w:line="264"/>
+            </w:pPr>
+            <w:r>
+              <w:t xml:space="preserve">C. Carbon dioxide</w:t>
+            </w:r>
+          </w:p>
+          <w:p>
+            <w:pPr>
+              <w:spacing w:after="40" w:line="264"/>
+            </w:pPr>
+            <w:r>
+              <w:t xml:space="preserve">D. Helium</w:t>
             </w:r>
           </w:p>
         </w:tc>
@@ -8026,10 +8018,10 @@
                 <w:b/>
                 <w:bCs/>
               </w:rPr>
-              <w:t xml:space="preserve">A.</w:t>
-            </w:r>
-            <w:r>
-              <w:t xml:space="preserve"> Folksonomy</w:t>
+              <w:t xml:space="preserve">C.</w:t>
+            </w:r>
+            <w:r>
+              <w:t xml:space="preserve"> Carbon dioxide</w:t>
             </w:r>
           </w:p>
         </w:tc>
@@ -8056,7 +8048,7 @@
               <w:t xml:space="preserve">Why:</w:t>
             </w:r>
             <w:r>
-              <w:t xml:space="preserve"> Folksonomy lets users categorize and classify information using freely chosen keywords, like hashtags. 'Folk' (people) + 'taxonomy' (classification) = classification made by the people.</w:t>
+              <w:t xml:space="preserve"> In photosynthesis, plants use sunlight, water, and carbon dioxide to make sugar for food. They release oxygen, the gas we need to breathe.</w:t>
             </w:r>
           </w:p>
           <w:p>
@@ -8071,7 +8063,7 @@
               <w:t xml:space="preserve">Hint:</w:t>
             </w:r>
             <w:r>
-              <w:t xml:space="preserve"> It is classification made by the 'folks', the people themselves.</w:t>
+              <w:t xml:space="preserve"> It's the same gas that we breathe OUT.</w:t>
             </w:r>
           </w:p>
         </w:tc>
@@ -8087,7 +8079,7 @@
         <w:pStyle w:val="Heading2"/>
       </w:pPr>
       <w:r>
-        <w:t xml:space="preserve">Sector 2: The Firewall Fortress</w:t>
+        <w:t xml:space="preserve">Sector 2: The Time Vault</w:t>
       </w:r>
     </w:p>
     <w:p>
@@ -8103,7 +8095,7 @@
         <w:t xml:space="preserve">Topic:</w:t>
       </w:r>
       <w:r>
-        <w:t xml:space="preserve"> Online Safety, Security, and Netiquette   |   </w:t>
+        <w:t xml:space="preserve"> Philippine History   |   </w:t>
       </w:r>
       <w:r>
         <w:rPr>
@@ -8288,31 +8280,39 @@
                 <w:b/>
                 <w:bCs/>
               </w:rPr>
-              <w:t xml:space="preserve">BYTE intercepted this message in Kai's inbox. Is it LEGIT or PHISHING?</w:t>
-            </w:r>
-          </w:p>
-          <w:p>
-            <w:pPr>
-              <w:spacing w:after="40" w:line="264"/>
-            </w:pPr>
-            <w:r>
-              <w:t xml:space="preserve">(Email from admin@sch00l-portal-login.net: "URGENT!!! Your account will be DELETED in 1 hour")</w:t>
-            </w:r>
-          </w:p>
-          <w:p>
-            <w:pPr>
-              <w:spacing w:after="40" w:line="264"/>
-            </w:pPr>
-            <w:r>
-              <w:t xml:space="preserve">A. LEGIT</w:t>
-            </w:r>
-          </w:p>
-          <w:p>
-            <w:pPr>
-              <w:spacing w:after="40" w:line="264"/>
-            </w:pPr>
-            <w:r>
-              <w:t xml:space="preserve">B. PHISHING</w:t>
+              <w:t xml:space="preserve">Which Filipino hero wrote the famous novels Noli Me Tangere and El Filibusterismo?</w:t>
+            </w:r>
+          </w:p>
+          <w:p>
+            <w:pPr>
+              <w:spacing w:after="40" w:line="264"/>
+            </w:pPr>
+            <w:r>
+              <w:t xml:space="preserve">A. Andres Bonifacio</w:t>
+            </w:r>
+          </w:p>
+          <w:p>
+            <w:pPr>
+              <w:spacing w:after="40" w:line="264"/>
+            </w:pPr>
+            <w:r>
+              <w:t xml:space="preserve">B. Emilio Aguinaldo</w:t>
+            </w:r>
+          </w:p>
+          <w:p>
+            <w:pPr>
+              <w:spacing w:after="40" w:line="264"/>
+            </w:pPr>
+            <w:r>
+              <w:t xml:space="preserve">C. Apolinario Mabini</w:t>
+            </w:r>
+          </w:p>
+          <w:p>
+            <w:pPr>
+              <w:spacing w:after="40" w:line="264"/>
+            </w:pPr>
+            <w:r>
+              <w:t xml:space="preserve">D. Jose Rizal</w:t>
             </w:r>
           </w:p>
         </w:tc>
@@ -8336,10 +8336,10 @@
                 <w:b/>
                 <w:bCs/>
               </w:rPr>
-              <w:t xml:space="preserve">B.</w:t>
-            </w:r>
-            <w:r>
-              <w:t xml:space="preserve"> PHISHING</w:t>
+              <w:t xml:space="preserve">D.</w:t>
+            </w:r>
+            <w:r>
+              <w:t xml:space="preserve"> Jose Rizal</w:t>
             </w:r>
           </w:p>
         </w:tc>
@@ -8366,7 +8366,7 @@
               <w:t xml:space="preserve">Why:</w:t>
             </w:r>
             <w:r>
-              <w:t xml:space="preserve"> Red flags: an urgent threat, a fake address that uses zeros ('sch00l'), and a request for your password. Real school admins never ask for your password by email. Report it and delete it.</w:t>
+              <w:t xml:space="preserve"> Dr. Jose Rizal wrote Noli Me Tangere (1887) and El Filibusterismo (1891). His novels showed the abuses of Spanish rule and inspired Filipinos to fight for change.</w:t>
             </w:r>
           </w:p>
           <w:p>
@@ -8381,7 +8381,7 @@
               <w:t xml:space="preserve">Hint:</w:t>
             </w:r>
             <w:r>
-              <w:t xml:space="preserve"> Look closely at the sender's address, and at what the message asks you to type.</w:t>
+              <w:t xml:space="preserve"> His monument stands in Rizal Park (Luneta) in Manila.</w:t>
             </w:r>
           </w:p>
         </w:tc>
@@ -8432,39 +8432,31 @@
                 <w:b/>
                 <w:bCs/>
               </w:rPr>
-              <w:t xml:space="preserve">To lock the Fortress gate, Kai must choose a password. Which one is the STRONGEST?</w:t>
-            </w:r>
-          </w:p>
-          <w:p>
-            <w:pPr>
-              <w:spacing w:after="40" w:line="264"/>
-            </w:pPr>
-            <w:r>
-              <w:t xml:space="preserve">A. juan2008</w:t>
-            </w:r>
-          </w:p>
-          <w:p>
-            <w:pPr>
-              <w:spacing w:after="40" w:line="264"/>
-            </w:pPr>
-            <w:r>
-              <w:t xml:space="preserve">B. password123</w:t>
-            </w:r>
-          </w:p>
-          <w:p>
-            <w:pPr>
-              <w:spacing w:after="40" w:line="264"/>
-            </w:pPr>
-            <w:r>
-              <w:t xml:space="preserve">C. Bl@ckC4t!Rides#Jeep9</w:t>
-            </w:r>
-          </w:p>
-          <w:p>
-            <w:pPr>
-              <w:spacing w:after="40" w:line="264"/>
-            </w:pPr>
-            <w:r>
-              <w:t xml:space="preserve">D. 12345678</w:t>
+              <w:t xml:space="preserve">This history file might be corrupted. Is the statement below a FACT or a MYTH?</w:t>
+            </w:r>
+          </w:p>
+          <w:p>
+            <w:pPr>
+              <w:spacing w:after="40" w:line="264"/>
+            </w:pPr>
+            <w:r>
+              <w:t xml:space="preserve">Statement: "Ferdinand Magellan was killed in the Battle of Mactan in 1521."</w:t>
+            </w:r>
+          </w:p>
+          <w:p>
+            <w:pPr>
+              <w:spacing w:after="40" w:line="264"/>
+            </w:pPr>
+            <w:r>
+              <w:t xml:space="preserve">A. FACT</w:t>
+            </w:r>
+          </w:p>
+          <w:p>
+            <w:pPr>
+              <w:spacing w:after="40" w:line="264"/>
+            </w:pPr>
+            <w:r>
+              <w:t xml:space="preserve">B. MYTH</w:t>
             </w:r>
           </w:p>
         </w:tc>
@@ -8489,10 +8481,10 @@
                 <w:b/>
                 <w:bCs/>
               </w:rPr>
-              <w:t xml:space="preserve">C.</w:t>
-            </w:r>
-            <w:r>
-              <w:t xml:space="preserve"> Bl@ckC4t!Rides#Jeep9</w:t>
+              <w:t xml:space="preserve">A.</w:t>
+            </w:r>
+            <w:r>
+              <w:t xml:space="preserve"> FACT</w:t>
             </w:r>
           </w:p>
         </w:tc>
@@ -8520,7 +8512,7 @@
               <w:t xml:space="preserve">Why:</w:t>
             </w:r>
             <w:r>
-              <w:t xml:space="preserve"> A strong password is long and mixes UPPERCASE and lowercase letters, numbers, and symbols. It also avoids names, birthdays, and common words that hackers guess first.</w:t>
+              <w:t xml:space="preserve"> It's a fact! On April 27, 1521, Magellan was killed in the Battle of Mactan by the warriors of Lapulapu, who is honored as one of the first Filipinos to resist foreign rule.</w:t>
             </w:r>
           </w:p>
           <w:p>
@@ -8535,7 +8527,7 @@
               <w:t xml:space="preserve">Hint:</w:t>
             </w:r>
             <w:r>
-              <w:t xml:space="preserve"> Longer + more kinds of characters = much harder to crack.</w:t>
+              <w:t xml:space="preserve"> Remember Lapulapu, the brave chieftain of Mactan.</w:t>
             </w:r>
           </w:p>
         </w:tc>
@@ -8584,39 +8576,39 @@
                 <w:b/>
                 <w:bCs/>
               </w:rPr>
-              <w:t xml:space="preserve">A 'FREE Game Hack' download looks useful, but it secretly opens a backdoor for hackers. What type of malware is it?</w:t>
-            </w:r>
-          </w:p>
-          <w:p>
-            <w:pPr>
-              <w:spacing w:after="40" w:line="264"/>
-            </w:pPr>
-            <w:r>
-              <w:t xml:space="preserve">A. Worm</w:t>
-            </w:r>
-          </w:p>
-          <w:p>
-            <w:pPr>
-              <w:spacing w:after="40" w:line="264"/>
-            </w:pPr>
-            <w:r>
-              <w:t xml:space="preserve">B. Spyware</w:t>
-            </w:r>
-          </w:p>
-          <w:p>
-            <w:pPr>
-              <w:spacing w:after="40" w:line="264"/>
-            </w:pPr>
-            <w:r>
-              <w:t xml:space="preserve">C. Trojan</w:t>
-            </w:r>
-          </w:p>
-          <w:p>
-            <w:pPr>
-              <w:spacing w:after="40" w:line="264"/>
-            </w:pPr>
-            <w:r>
-              <w:t xml:space="preserve">D. Adware</w:t>
+              <w:t xml:space="preserve">On what date does the Philippines celebrate its Independence Day?</w:t>
+            </w:r>
+          </w:p>
+          <w:p>
+            <w:pPr>
+              <w:spacing w:after="40" w:line="264"/>
+            </w:pPr>
+            <w:r>
+              <w:t xml:space="preserve">A. December 30</w:t>
+            </w:r>
+          </w:p>
+          <w:p>
+            <w:pPr>
+              <w:spacing w:after="40" w:line="264"/>
+            </w:pPr>
+            <w:r>
+              <w:t xml:space="preserve">B. June 12</w:t>
+            </w:r>
+          </w:p>
+          <w:p>
+            <w:pPr>
+              <w:spacing w:after="40" w:line="264"/>
+            </w:pPr>
+            <w:r>
+              <w:t xml:space="preserve">C. August 21</w:t>
+            </w:r>
+          </w:p>
+          <w:p>
+            <w:pPr>
+              <w:spacing w:after="40" w:line="264"/>
+            </w:pPr>
+            <w:r>
+              <w:t xml:space="preserve">D. November 30</w:t>
             </w:r>
           </w:p>
         </w:tc>
@@ -8640,10 +8632,10 @@
                 <w:b/>
                 <w:bCs/>
               </w:rPr>
-              <w:t xml:space="preserve">C.</w:t>
-            </w:r>
-            <w:r>
-              <w:t xml:space="preserve"> Trojan</w:t>
+              <w:t xml:space="preserve">B.</w:t>
+            </w:r>
+            <w:r>
+              <w:t xml:space="preserve"> June 12</w:t>
             </w:r>
           </w:p>
         </w:tc>
@@ -8670,7 +8662,7 @@
               <w:t xml:space="preserve">Why:</w:t>
             </w:r>
             <w:r>
-              <w:t xml:space="preserve"> A Trojan pretends to be useful software but hides something harmful, just like the wooden horse in the Greek legend. Worms spread by themselves, spyware secretly watches you, and adware floods you with ads.</w:t>
+              <w:t xml:space="preserve"> On June 12, 1898, Emilio Aguinaldo declared the independence of the Philippines from Spain in Kawit, Cavite. December 30 is Rizal Day and November 30 is Bonifacio Day.</w:t>
             </w:r>
           </w:p>
           <w:p>
@@ -8685,7 +8677,7 @@
               <w:t xml:space="preserve">Hint:</w:t>
             </w:r>
             <w:r>
-              <w:t xml:space="preserve"> Remember the legend of the giant wooden horse at the gates of Troy.</w:t>
+              <w:t xml:space="preserve"> It's in the month when the rainy season usually begins.</w:t>
             </w:r>
           </w:p>
         </w:tc>
@@ -8701,7 +8693,7 @@
         <w:pStyle w:val="Heading2"/>
       </w:pPr>
       <w:r>
-        <w:t xml:space="preserve">Sector 3: The Office Archives</w:t>
+        <w:t xml:space="preserve">Sector 3: The Fun Zone</w:t>
       </w:r>
     </w:p>
     <w:p>
@@ -8717,7 +8709,7 @@
         <w:t xml:space="preserve">Topic:</w:t>
       </w:r>
       <w:r>
-        <w:t xml:space="preserve"> Productivity Tools (Word, Excel, PowerPoint)   |   </w:t>
+        <w:t xml:space="preserve"> Everyday Life: Food, Sports, and Money   |   </w:t>
       </w:r>
       <w:r>
         <w:rPr>
@@ -8902,39 +8894,39 @@
                 <w:b/>
                 <w:bCs/>
               </w:rPr>
-              <w:t xml:space="preserve">The principal needs 300 invitation letters, each with a different parent's name and address. Which MS Word feature creates them all automatically?</w:t>
-            </w:r>
-          </w:p>
-          <w:p>
-            <w:pPr>
-              <w:spacing w:after="40" w:line="264"/>
-            </w:pPr>
-            <w:r>
-              <w:t xml:space="preserve">A. Track Changes</w:t>
-            </w:r>
-          </w:p>
-          <w:p>
-            <w:pPr>
-              <w:spacing w:after="40" w:line="264"/>
-            </w:pPr>
-            <w:r>
-              <w:t xml:space="preserve">B. WordArt</w:t>
-            </w:r>
-          </w:p>
-          <w:p>
-            <w:pPr>
-              <w:spacing w:after="40" w:line="264"/>
-            </w:pPr>
-            <w:r>
-              <w:t xml:space="preserve">C. Mail Merge</w:t>
-            </w:r>
-          </w:p>
-          <w:p>
-            <w:pPr>
-              <w:spacing w:after="40" w:line="264"/>
-            </w:pPr>
-            <w:r>
-              <w:t xml:space="preserve">D. Page Break</w:t>
+              <w:t xml:space="preserve">In basketball, how many players from ONE team are on the court at the same time?</w:t>
+            </w:r>
+          </w:p>
+          <w:p>
+            <w:pPr>
+              <w:spacing w:after="40" w:line="264"/>
+            </w:pPr>
+            <w:r>
+              <w:t xml:space="preserve">A. 5</w:t>
+            </w:r>
+          </w:p>
+          <w:p>
+            <w:pPr>
+              <w:spacing w:after="40" w:line="264"/>
+            </w:pPr>
+            <w:r>
+              <w:t xml:space="preserve">B. 6</w:t>
+            </w:r>
+          </w:p>
+          <w:p>
+            <w:pPr>
+              <w:spacing w:after="40" w:line="264"/>
+            </w:pPr>
+            <w:r>
+              <w:t xml:space="preserve">C. 7</w:t>
+            </w:r>
+          </w:p>
+          <w:p>
+            <w:pPr>
+              <w:spacing w:after="40" w:line="264"/>
+            </w:pPr>
+            <w:r>
+              <w:t xml:space="preserve">D. 11</w:t>
             </w:r>
           </w:p>
         </w:tc>
@@ -8958,10 +8950,10 @@
                 <w:b/>
                 <w:bCs/>
               </w:rPr>
-              <w:t xml:space="preserve">C.</w:t>
-            </w:r>
-            <w:r>
-              <w:t xml:space="preserve"> Mail Merge</w:t>
+              <w:t xml:space="preserve">A.</w:t>
+            </w:r>
+            <w:r>
+              <w:t xml:space="preserve"> 5</w:t>
             </w:r>
           </w:p>
         </w:tc>
@@ -8988,7 +8980,7 @@
               <w:t xml:space="preserve">Why:</w:t>
             </w:r>
             <w:r>
-              <w:t xml:space="preserve"> Mail Merge combines one main document with a data source (like an Excel list of names) to produce personalized copies of letters, envelopes, labels, or certificates in seconds.</w:t>
+              <w:t xml:space="preserve"> Each basketball team has 5 players on the court: usually 2 guards, 2 forwards, and a center. Volleyball has 6 players per team, and football (soccer) has 11.</w:t>
             </w:r>
           </w:p>
           <w:p>
@@ -9003,7 +8995,7 @@
               <w:t xml:space="preserve">Hint:</w:t>
             </w:r>
             <w:r>
-              <w:t xml:space="preserve"> You MERGE one letter with a whole list of names.</w:t>
+              <w:t xml:space="preserve"> Count the fingers on one hand.</w:t>
             </w:r>
           </w:p>
         </w:tc>
@@ -9054,39 +9046,47 @@
                 <w:b/>
                 <w:bCs/>
               </w:rPr>
-              <w:t xml:space="preserve">The vault opens with the TOTAL of cells B2 to B6. Which Excel formula is correct?</w:t>
-            </w:r>
-          </w:p>
-          <w:p>
-            <w:pPr>
-              <w:spacing w:after="40" w:line="264"/>
-            </w:pPr>
-            <w:r>
-              <w:t xml:space="preserve">A. =SUM(B2:B6)</w:t>
-            </w:r>
-          </w:p>
-          <w:p>
-            <w:pPr>
-              <w:spacing w:after="40" w:line="264"/>
-            </w:pPr>
-            <w:r>
-              <w:t xml:space="preserve">B. =ADD(B2-B6)</w:t>
-            </w:r>
-          </w:p>
-          <w:p>
-            <w:pPr>
-              <w:spacing w:after="40" w:line="264"/>
-            </w:pPr>
-            <w:r>
-              <w:t xml:space="preserve">C. SUM(B2,B6)</w:t>
-            </w:r>
-          </w:p>
-          <w:p>
-            <w:pPr>
-              <w:spacing w:after="40" w:line="264"/>
-            </w:pPr>
-            <w:r>
-              <w:t xml:space="preserve">D. =TOTAL(B2:B6)</w:t>
+              <w:t xml:space="preserve">Kai buys merienda at the sari-sari store. The vault opens with the TOTAL. How much is it?</w:t>
+            </w:r>
+          </w:p>
+          <w:p>
+            <w:pPr>
+              <w:spacing w:after="40" w:line="264"/>
+            </w:pPr>
+            <w:r>
+              <w:t xml:space="preserve">Receipt: Pandesal (10 pcs) 50, Banana cue 25, Softdrink 20, Chips 15, Candy 5</w:t>
+            </w:r>
+          </w:p>
+          <w:p>
+            <w:pPr>
+              <w:spacing w:after="40" w:line="264"/>
+            </w:pPr>
+            <w:r>
+              <w:t xml:space="preserve">A. PHP 105</w:t>
+            </w:r>
+          </w:p>
+          <w:p>
+            <w:pPr>
+              <w:spacing w:after="40" w:line="264"/>
+            </w:pPr>
+            <w:r>
+              <w:t xml:space="preserve">B. PHP 120</w:t>
+            </w:r>
+          </w:p>
+          <w:p>
+            <w:pPr>
+              <w:spacing w:after="40" w:line="264"/>
+            </w:pPr>
+            <w:r>
+              <w:t xml:space="preserve">C. PHP 115</w:t>
+            </w:r>
+          </w:p>
+          <w:p>
+            <w:pPr>
+              <w:spacing w:after="40" w:line="264"/>
+            </w:pPr>
+            <w:r>
+              <w:t xml:space="preserve">D. PHP 125</w:t>
             </w:r>
           </w:p>
         </w:tc>
@@ -9111,10 +9111,10 @@
                 <w:b/>
                 <w:bCs/>
               </w:rPr>
-              <w:t xml:space="preserve">A.</w:t>
-            </w:r>
-            <w:r>
-              <w:t xml:space="preserve"> =SUM(B2:B6)</w:t>
+              <w:t xml:space="preserve">C.</w:t>
+            </w:r>
+            <w:r>
+              <w:t xml:space="preserve"> PHP 115</w:t>
             </w:r>
           </w:p>
         </w:tc>
@@ -9142,7 +9142,7 @@
               <w:t xml:space="preserve">Why:</w:t>
             </w:r>
             <w:r>
-              <w:t xml:space="preserve"> Every formula starts with '=', SUM adds numbers, and the colon (:) means 'from B2 to B6'. The total is 3,200. Option C has no '=' and only adds two cells.</w:t>
+              <w:t xml:space="preserve"> 50 + 25 + 20 + 15 + 5 = 115, so the total is PHP 115. Tip: add the big numbers first (50 + 25 = 75), then add the rest (75 + 20 + 15 + 5 = 115).</w:t>
             </w:r>
           </w:p>
           <w:p>
@@ -9157,7 +9157,7 @@
               <w:t xml:space="preserve">Hint:</w:t>
             </w:r>
             <w:r>
-              <w:t xml:space="preserve"> Every formula begins with the same symbol, and a range uses a colon.</w:t>
+              <w:t xml:space="preserve"> Add the prices two at a time, then double-check your answer.</w:t>
             </w:r>
           </w:p>
         </w:tc>
@@ -9206,39 +9206,39 @@
                 <w:b/>
                 <w:bCs/>
               </w:rPr>
-              <w:t xml:space="preserve">This very game jumps to different slides when you click a button. Which PowerPoint feature makes that possible?</w:t>
-            </w:r>
-          </w:p>
-          <w:p>
-            <w:pPr>
-              <w:spacing w:after="40" w:line="264"/>
-            </w:pPr>
-            <w:r>
-              <w:t xml:space="preserve">A. Slide Master</w:t>
-            </w:r>
-          </w:p>
-          <w:p>
-            <w:pPr>
-              <w:spacing w:after="40" w:line="264"/>
-            </w:pPr>
-            <w:r>
-              <w:t xml:space="preserve">B. Hyperlinks and Action Settings</w:t>
-            </w:r>
-          </w:p>
-          <w:p>
-            <w:pPr>
-              <w:spacing w:after="40" w:line="264"/>
-            </w:pPr>
-            <w:r>
-              <w:t xml:space="preserve">C. Spell Check</w:t>
-            </w:r>
-          </w:p>
-          <w:p>
-            <w:pPr>
-              <w:spacing w:after="40" w:line="264"/>
-            </w:pPr>
-            <w:r>
-              <w:t xml:space="preserve">D. Slide Sorter</w:t>
+              <w:t xml:space="preserve">What ingredient is most commonly used to give the Filipino dish sinigang its sour taste?</w:t>
+            </w:r>
+          </w:p>
+          <w:p>
+            <w:pPr>
+              <w:spacing w:after="40" w:line="264"/>
+            </w:pPr>
+            <w:r>
+              <w:t xml:space="preserve">A. Coconut milk</w:t>
+            </w:r>
+          </w:p>
+          <w:p>
+            <w:pPr>
+              <w:spacing w:after="40" w:line="264"/>
+            </w:pPr>
+            <w:r>
+              <w:t xml:space="preserve">B. Soy sauce</w:t>
+            </w:r>
+          </w:p>
+          <w:p>
+            <w:pPr>
+              <w:spacing w:after="40" w:line="264"/>
+            </w:pPr>
+            <w:r>
+              <w:t xml:space="preserve">C. Sugar</w:t>
+            </w:r>
+          </w:p>
+          <w:p>
+            <w:pPr>
+              <w:spacing w:after="40" w:line="264"/>
+            </w:pPr>
+            <w:r>
+              <w:t xml:space="preserve">D. Tamarind (sampalok)</w:t>
             </w:r>
           </w:p>
         </w:tc>
@@ -9262,10 +9262,10 @@
                 <w:b/>
                 <w:bCs/>
               </w:rPr>
-              <w:t xml:space="preserve">B.</w:t>
-            </w:r>
-            <w:r>
-              <w:t xml:space="preserve"> Hyperlinks and Action Settings</w:t>
+              <w:t xml:space="preserve">D.</w:t>
+            </w:r>
+            <w:r>
+              <w:t xml:space="preserve"> Tamarind (sampalok)</w:t>
             </w:r>
           </w:p>
         </w:tc>
@@ -9292,7 +9292,7 @@
               <w:t xml:space="preserve">Why:</w:t>
             </w:r>
             <w:r>
-              <w:t xml:space="preserve"> Hyperlinks (Insert &gt; Link) and Action Settings (Insert &gt; Action) let any shape or picture jump to a slide, a file, or a website. They are the secret behind every PowerPoint game.</w:t>
+              <w:t xml:space="preserve"> Sinigang gets its famous sour taste from tamarind (sampalok). Some versions use guava, kamias, or green mango instead. Coconut milk is used in dishes like ginataan.</w:t>
             </w:r>
           </w:p>
           <w:p>
@@ -9307,7 +9307,7 @@
               <w:t xml:space="preserve">Hint:</w:t>
             </w:r>
             <w:r>
-              <w:t xml:space="preserve"> It's the same feature that makes clickable links on websites.</w:t>
+              <w:t xml:space="preserve"> It grows in brown, curved pods, and kids love it as candy too!</w:t>
             </w:r>
           </w:p>
         </w:tc>
@@ -9323,7 +9323,7 @@
         <w:pStyle w:val="Heading2"/>
       </w:pPr>
       <w:r>
-        <w:t xml:space="preserve">Sector 4: The Search Maze</w:t>
+        <w:t xml:space="preserve">Sector 4: The World Map</w:t>
       </w:r>
     </w:p>
     <w:p>
@@ -9339,7 +9339,7 @@
         <w:t xml:space="preserve">Topic:</w:t>
       </w:r>
       <w:r>
-        <w:t xml:space="preserve"> Online Search, Research, and Intellectual Property   |   </w:t>
+        <w:t xml:space="preserve"> Geography of the Philippines and the World   |   </w:t>
       </w:r>
       <w:r>
         <w:rPr>
@@ -9524,39 +9524,39 @@
                 <w:b/>
                 <w:bCs/>
               </w:rPr>
-              <w:t xml:space="preserve">Kai needs scholarship info ONLY from Philippine government websites. Which door (search query) leads the right way?</w:t>
-            </w:r>
-          </w:p>
-          <w:p>
-            <w:pPr>
-              <w:spacing w:after="40" w:line="264"/>
-            </w:pPr>
-            <w:r>
-              <w:t xml:space="preserve">A. scholarship site:gov.ph</w:t>
-            </w:r>
-          </w:p>
-          <w:p>
-            <w:pPr>
-              <w:spacing w:after="40" w:line="264"/>
-            </w:pPr>
-            <w:r>
-              <w:t xml:space="preserve">B. scholarship -gov.ph</w:t>
-            </w:r>
-          </w:p>
-          <w:p>
-            <w:pPr>
-              <w:spacing w:after="40" w:line="264"/>
-            </w:pPr>
-            <w:r>
-              <w:t xml:space="preserve">C. "scholarship" gov</w:t>
-            </w:r>
-          </w:p>
-          <w:p>
-            <w:pPr>
-              <w:spacing w:after="40" w:line="264"/>
-            </w:pPr>
-            <w:r>
-              <w:t xml:space="preserve">D. scholarship OR gov.ph</w:t>
+              <w:t xml:space="preserve">Kai must travel to the capital city of Japan. Which door leads there?</w:t>
+            </w:r>
+          </w:p>
+          <w:p>
+            <w:pPr>
+              <w:spacing w:after="40" w:line="264"/>
+            </w:pPr>
+            <w:r>
+              <w:t xml:space="preserve">A. Kyoto</w:t>
+            </w:r>
+          </w:p>
+          <w:p>
+            <w:pPr>
+              <w:spacing w:after="40" w:line="264"/>
+            </w:pPr>
+            <w:r>
+              <w:t xml:space="preserve">B. Tokyo</w:t>
+            </w:r>
+          </w:p>
+          <w:p>
+            <w:pPr>
+              <w:spacing w:after="40" w:line="264"/>
+            </w:pPr>
+            <w:r>
+              <w:t xml:space="preserve">C. Osaka</w:t>
+            </w:r>
+          </w:p>
+          <w:p>
+            <w:pPr>
+              <w:spacing w:after="40" w:line="264"/>
+            </w:pPr>
+            <w:r>
+              <w:t xml:space="preserve">D. Seoul</w:t>
             </w:r>
           </w:p>
         </w:tc>
@@ -9580,10 +9580,10 @@
                 <w:b/>
                 <w:bCs/>
               </w:rPr>
-              <w:t xml:space="preserve">A.</w:t>
-            </w:r>
-            <w:r>
-              <w:t xml:space="preserve"> scholarship site:gov.ph</w:t>
+              <w:t xml:space="preserve">B.</w:t>
+            </w:r>
+            <w:r>
+              <w:t xml:space="preserve"> Tokyo</w:t>
             </w:r>
           </w:p>
         </w:tc>
@@ -9610,7 +9610,7 @@
               <w:t xml:space="preserve">Why:</w:t>
             </w:r>
             <w:r>
-              <w:t xml:space="preserve"> The site: operator limits results to one domain, so site:gov.ph shows only government pages. A minus sign (-) EXCLUDES a word, and quotation marks search for an exact phrase.</w:t>
+              <w:t xml:space="preserve"> Tokyo is the capital of Japan and one of the biggest cities in the world. Kyoto is Japan's old capital, Osaka is another big Japanese city, and Seoul is the capital of South Korea.</w:t>
             </w:r>
           </w:p>
           <w:p>
@@ -9625,7 +9625,7 @@
               <w:t xml:space="preserve">Hint:</w:t>
             </w:r>
             <w:r>
-              <w:t xml:space="preserve"> One search operator tells the engine which SITE to look inside.</w:t>
+              <w:t xml:space="preserve"> This city hosted the 2020 Summer Olympics.</w:t>
             </w:r>
           </w:p>
         </w:tc>
@@ -9676,39 +9676,39 @@
                 <w:b/>
                 <w:bCs/>
               </w:rPr>
-              <w:t xml:space="preserve">For a research paper on typhoon safety, which source is the MOST reliable?</w:t>
-            </w:r>
-          </w:p>
-          <w:p>
-            <w:pPr>
-              <w:spacing w:after="40" w:line="264"/>
-            </w:pPr>
-            <w:r>
-              <w:t xml:space="preserve">A. A meme page with 1 million followers</w:t>
-            </w:r>
-          </w:p>
-          <w:p>
-            <w:pPr>
-              <w:spacing w:after="40" w:line="264"/>
-            </w:pPr>
-            <w:r>
-              <w:t xml:space="preserve">B. An anonymous comment on a forum</w:t>
-            </w:r>
-          </w:p>
-          <w:p>
-            <w:pPr>
-              <w:spacing w:after="40" w:line="264"/>
-            </w:pPr>
-            <w:r>
-              <w:t xml:space="preserve">C. The national weather bureau's official .gov.ph website</w:t>
-            </w:r>
-          </w:p>
-          <w:p>
-            <w:pPr>
-              <w:spacing w:after="40" w:line="264"/>
-            </w:pPr>
-            <w:r>
-              <w:t xml:space="preserve">D. A site titled 'SHOCKING typhoon secrets!!!'</w:t>
+              <w:t xml:space="preserve">What is the largest ocean on Earth?</w:t>
+            </w:r>
+          </w:p>
+          <w:p>
+            <w:pPr>
+              <w:spacing w:after="40" w:line="264"/>
+            </w:pPr>
+            <w:r>
+              <w:t xml:space="preserve">A. Pacific Ocean</w:t>
+            </w:r>
+          </w:p>
+          <w:p>
+            <w:pPr>
+              <w:spacing w:after="40" w:line="264"/>
+            </w:pPr>
+            <w:r>
+              <w:t xml:space="preserve">B. Atlantic Ocean</w:t>
+            </w:r>
+          </w:p>
+          <w:p>
+            <w:pPr>
+              <w:spacing w:after="40" w:line="264"/>
+            </w:pPr>
+            <w:r>
+              <w:t xml:space="preserve">C. Indian Ocean</w:t>
+            </w:r>
+          </w:p>
+          <w:p>
+            <w:pPr>
+              <w:spacing w:after="40" w:line="264"/>
+            </w:pPr>
+            <w:r>
+              <w:t xml:space="preserve">D. Arctic Ocean</w:t>
             </w:r>
           </w:p>
         </w:tc>
@@ -9733,10 +9733,10 @@
                 <w:b/>
                 <w:bCs/>
               </w:rPr>
-              <w:t xml:space="preserve">C.</w:t>
-            </w:r>
-            <w:r>
-              <w:t xml:space="preserve"> The national weather bureau's official .gov.ph website</w:t>
+              <w:t xml:space="preserve">A.</w:t>
+            </w:r>
+            <w:r>
+              <w:t xml:space="preserve"> Pacific Ocean</w:t>
             </w:r>
           </w:p>
         </w:tc>
@@ -9764,7 +9764,7 @@
               <w:t xml:space="preserve">Why:</w:t>
             </w:r>
             <w:r>
-              <w:t xml:space="preserve"> Check a source's authority, accuracy, and purpose. Official government and academic websites are written by experts who are accountable for the information. Clickbait and anonymous posts are not.</w:t>
+              <w:t xml:space="preserve"> The Pacific Ocean is the largest and deepest ocean, covering about one-third of Earth's surface. The Philippines sits on its western side.</w:t>
             </w:r>
           </w:p>
           <w:p>
@@ -9779,7 +9779,7 @@
               <w:t xml:space="preserve">Hint:</w:t>
             </w:r>
             <w:r>
-              <w:t xml:space="preserve"> Who is the real expert, and who is accountable for the information?</w:t>
+              <w:t xml:space="preserve"> It's the ocean right next to the Philippines.</w:t>
             </w:r>
           </w:p>
         </w:tc>
@@ -9828,39 +9828,39 @@
                 <w:b/>
                 <w:bCs/>
               </w:rPr>
-              <w:t xml:space="preserve">Kai finds a cool image online for the group's game. What is the RIGHT way to use it?</w:t>
-            </w:r>
-          </w:p>
-          <w:p>
-            <w:pPr>
-              <w:spacing w:after="40" w:line="264"/>
-            </w:pPr>
-            <w:r>
-              <w:t xml:space="preserve">A. Download it, because everything online is free</w:t>
-            </w:r>
-          </w:p>
-          <w:p>
-            <w:pPr>
-              <w:spacing w:after="40" w:line="264"/>
-            </w:pPr>
-            <w:r>
-              <w:t xml:space="preserve">B. Crop out the watermark first</w:t>
-            </w:r>
-          </w:p>
-          <w:p>
-            <w:pPr>
-              <w:spacing w:after="40" w:line="264"/>
-            </w:pPr>
-            <w:r>
-              <w:t xml:space="preserve">C. Use a free or Creative Commons image and credit the creator</w:t>
-            </w:r>
-          </w:p>
-          <w:p>
-            <w:pPr>
-              <w:spacing w:after="40" w:line="264"/>
-            </w:pPr>
-            <w:r>
-              <w:t xml:space="preserve">D. Say that you drew it yourself</w:t>
+              <w:t xml:space="preserve">Which is the highest mountain in the Philippines?</w:t>
+            </w:r>
+          </w:p>
+          <w:p>
+            <w:pPr>
+              <w:spacing w:after="40" w:line="264"/>
+            </w:pPr>
+            <w:r>
+              <w:t xml:space="preserve">A. Mount Mayon</w:t>
+            </w:r>
+          </w:p>
+          <w:p>
+            <w:pPr>
+              <w:spacing w:after="40" w:line="264"/>
+            </w:pPr>
+            <w:r>
+              <w:t xml:space="preserve">B. Mount Pulag</w:t>
+            </w:r>
+          </w:p>
+          <w:p>
+            <w:pPr>
+              <w:spacing w:after="40" w:line="264"/>
+            </w:pPr>
+            <w:r>
+              <w:t xml:space="preserve">C. Mount Apo</w:t>
+            </w:r>
+          </w:p>
+          <w:p>
+            <w:pPr>
+              <w:spacing w:after="40" w:line="264"/>
+            </w:pPr>
+            <w:r>
+              <w:t xml:space="preserve">D. Mount Pinatubo</w:t>
             </w:r>
           </w:p>
         </w:tc>
@@ -9887,7 +9887,7 @@
               <w:t xml:space="preserve">C.</w:t>
             </w:r>
             <w:r>
-              <w:t xml:space="preserve"> Use a free or Creative Commons image and credit the creator</w:t>
+              <w:t xml:space="preserve"> Mount Apo</w:t>
             </w:r>
           </w:p>
         </w:tc>
@@ -9914,7 +9914,7 @@
               <w:t xml:space="preserve">Why:</w:t>
             </w:r>
             <w:r>
-              <w:t xml:space="preserve"> Images are intellectual property. Use royalty-free or Creative Commons images (or ask permission), and always credit the creator. Removing watermarks or claiming someone's work is plagiarism.</w:t>
+              <w:t xml:space="preserve"> Mount Apo in Mindanao is the highest peak in the Philippines, at about 2,950 meters above sea level. Mount Pulag is the highest in Luzon, and Mayon is famous for its perfect cone shape.</w:t>
             </w:r>
           </w:p>
           <w:p>
@@ -9929,7 +9929,7 @@
               <w:t xml:space="preserve">Hint:</w:t>
             </w:r>
             <w:r>
-              <w:t xml:space="preserve"> Respect the creator's rights, and always give credit.</w:t>
+              <w:t xml:space="preserve"> It's on the island of Mindanao, near Davao City.</w:t>
             </w:r>
           </w:p>
         </w:tc>
@@ -10152,15 +10152,15 @@
               <w:spacing w:after="40" w:line="264"/>
             </w:pPr>
             <w:r>
-              <w:t xml:space="preserve">B. Close it without clicking and run an antivirus scan</w:t>
-            </w:r>
-          </w:p>
-          <w:p>
-            <w:pPr>
-              <w:spacing w:after="40" w:line="264"/>
-            </w:pPr>
-            <w:r>
-              <w:t xml:space="preserve">C. Share it so your friends can win too</w:t>
+              <w:t xml:space="preserve">B. Share it so your friends can win too</w:t>
+            </w:r>
+          </w:p>
+          <w:p>
+            <w:pPr>
+              <w:spacing w:after="40" w:line="264"/>
+            </w:pPr>
+            <w:r>
+              <w:t xml:space="preserve">C. Close it without clicking and run an antivirus scan</w:t>
             </w:r>
           </w:p>
           <w:p>
@@ -10192,7 +10192,7 @@
                 <w:b/>
                 <w:bCs/>
               </w:rPr>
-              <w:t xml:space="preserve">B.</w:t>
+              <w:t xml:space="preserve">C.</w:t>
             </w:r>
             <w:r>
               <w:t xml:space="preserve"> Close it without clicking and run an antivirus scan</w:t>
@@ -10834,7 +10834,7 @@
               <w:spacing w:after="40" w:line="264"/>
             </w:pPr>
             <w:r>
-              <w:t xml:space="preserve">BYTE, Sector 1, and main buttons</w:t>
+              <w:t xml:space="preserve">BYTE, Sector 1: The Science Lab, and main buttons</w:t>
             </w:r>
           </w:p>
         </w:tc>
@@ -11147,7 +11147,7 @@
                 <w:b/>
                 <w:bCs/>
               </w:rPr>
-              <w:t xml:space="preserve">Firewall Orange</w:t>
+              <w:t xml:space="preserve">Vault Orange</w:t>
             </w:r>
           </w:p>
         </w:tc>
@@ -11190,7 +11190,7 @@
               <w:spacing w:after="40" w:line="264"/>
             </w:pPr>
             <w:r>
-              <w:t xml:space="preserve">Sector 2</w:t>
+              <w:t xml:space="preserve">Sector 2: The Time Vault</w:t>
             </w:r>
           </w:p>
         </w:tc>
@@ -11236,7 +11236,7 @@
                 <w:b/>
                 <w:bCs/>
               </w:rPr>
-              <w:t xml:space="preserve">Archive Violet</w:t>
+              <w:t xml:space="preserve">Fun Zone Violet</w:t>
             </w:r>
           </w:p>
         </w:tc>
@@ -11279,7 +11279,7 @@
               <w:spacing w:after="40" w:line="264"/>
             </w:pPr>
             <w:r>
-              <w:t xml:space="preserve">Sector 3</w:t>
+              <w:t xml:space="preserve">Sector 3: The Fun Zone</w:t>
             </w:r>
           </w:p>
         </w:tc>
@@ -11325,7 +11325,7 @@
                 <w:b/>
                 <w:bCs/>
               </w:rPr>
-              <w:t xml:space="preserve">Maze Lime</w:t>
+              <w:t xml:space="preserve">Map Lime</w:t>
             </w:r>
           </w:p>
         </w:tc>
@@ -11368,7 +11368,7 @@
               <w:spacing w:after="40" w:line="264"/>
             </w:pPr>
             <w:r>
-              <w:t xml:space="preserve">Sector 4</w:t>
+              <w:t xml:space="preserve">Sector 4: The World Map</w:t>
             </w:r>
           </w:p>
         </w:tc>
@@ -11691,7 +11691,7 @@
                 <w:b w:val="false"/>
                 <w:bCs w:val="false"/>
               </w:rPr>
-              <w:t xml:space="preserve">Top bar, labels, formulas, search queries, and codes</w:t>
+              <w:t xml:space="preserve">Top bar, labels, receipts, door signs, and codes</w:t>
             </w:r>
           </w:p>
         </w:tc>
@@ -12561,7 +12561,7 @@
                 <w:b w:val="false"/>
                 <w:bCs w:val="false"/>
               </w:rPr>
-              <w:t xml:space="preserve">560 links connect every answer, button, and door to the correct slide.</w:t>
+              <w:t xml:space="preserve">548 links connect every answer, button, and door to the correct slide.</w:t>
             </w:r>
           </w:p>
         </w:tc>
@@ -13001,7 +13001,7 @@
                 <w:b w:val="false"/>
                 <w:bCs w:val="false"/>
               </w:rPr>
-              <w:t xml:space="preserve">Buttons, dialog boxes, the inbox mock-up, the Excel mini-sheet, and pixel-art characters.</w:t>
+              <w:t xml:space="preserve">Buttons, dialog boxes, the Fact or Myth cards, the receipt table, and pixel-art characters.</w:t>
             </w:r>
           </w:p>
         </w:tc>
@@ -15074,7 +15074,7 @@
               <w:spacing w:after="40" w:line="264"/>
             </w:pPr>
             <w:r>
-              <w:t xml:space="preserve">Every hyperlink leads to a slide that exists (560 links)</w:t>
+              <w:t xml:space="preserve">Every hyperlink leads to a slide that exists (548 links)</w:t>
             </w:r>
           </w:p>
         </w:tc>
@@ -16796,7 +16796,7 @@
                 <w:b w:val="false"/>
                 <w:bCs w:val="false"/>
               </w:rPr>
-              <w:t xml:space="preserve">A fully playable game with 560 links, five challenge types, shields, fragments, a code lock, and three victory ranks.</w:t>
+              <w:t xml:space="preserve">A fully playable game with 548 links, five challenge types, shields, fragments, a code lock, and three victory ranks.</w:t>
             </w:r>
           </w:p>
         </w:tc>
@@ -16902,7 +16902,7 @@
         <w:spacing w:after="80" w:line="276"/>
       </w:pPr>
       <w:r>
-        <w:t xml:space="preserve">Future ideas: a timer challenge, a new sector about image editing and online platforms, shuffled questions for replay value, and a two-player mode.</w:t>
+        <w:t xml:space="preserve">Future ideas: a timer challenge, new sectors about music, movies, and animals, shuffled questions for replay value, and a two-player mode.</w:t>
       </w:r>
     </w:p>
     <w:p>
@@ -17089,10 +17089,10 @@
           <w:b/>
           <w:bCs/>
         </w:rPr>
-        <w:t xml:space="preserve">Lesson content:</w:t>
-      </w:r>
-      <w:r>
-        <w:t xml:space="preserve"> based on the Empowerment Technologies topics in the DepEd K to 12 Senior High School curriculum: ICT and the World Wide Web, online safety, security, and netiquette, productivity tools, and contextualized online search and research.</w:t>
+        <w:t xml:space="preserve">Game content:</w:t>
+      </w:r>
+      <w:r>
+        <w:t xml:space="preserve"> common general knowledge in science, Philippine history, everyday life, and geography. Every fact used in the questions can be checked in an encyclopedia or a school textbook.</w:t>
       </w:r>
     </w:p>
     <w:p>
@@ -17105,7 +17105,14 @@
         <w:spacing w:after="80" w:line="276"/>
       </w:pPr>
       <w:r>
-        <w:t xml:space="preserve">[Add the textbook or learning module your class uses.]</w:t>
+        <w:rPr>
+          <w:b/>
+          <w:bCs/>
+        </w:rPr>
+        <w:t xml:space="preserve">Software:</w:t>
+      </w:r>
+      <w:r>
+        <w:t xml:space="preserve"> Microsoft PowerPoint (game) and Microsoft Word (documentation).</w:t>
       </w:r>
     </w:p>
     <w:p>
@@ -17122,10 +17129,10 @@
           <w:b/>
           <w:bCs/>
         </w:rPr>
-        <w:t xml:space="preserve">Software:</w:t>
-      </w:r>
-      <w:r>
-        <w:t xml:space="preserve"> Microsoft PowerPoint (game) and Microsoft Word (documentation).</w:t>
+        <w:t xml:space="preserve">Original assets:</w:t>
+      </w:r>
+      <w:r>
+        <w:t xml:space="preserve"> the story, characters, questions, pixel art, and sound effects are original to this project. No copyrighted images or music were used.</w:t>
       </w:r>
     </w:p>
     <w:p>
@@ -17142,30 +17149,10 @@
           <w:b/>
           <w:bCs/>
         </w:rPr>
-        <w:t xml:space="preserve">Original assets:</w:t>
-      </w:r>
-      <w:r>
-        <w:t xml:space="preserve"> the story, characters, questions, pixel art, and sound effects are original to this project. No copyrighted images or music were used.</w:t>
-      </w:r>
-    </w:p>
-    <w:p>
-      <w:pPr>
-        <w:pStyle w:val="ListParagraph"/>
-        <w:numPr>
-          <w:ilvl w:val="0"/>
-          <w:numId w:val="2"/>
-        </w:numPr>
-        <w:spacing w:after="80" w:line="276"/>
-      </w:pPr>
-      <w:r>
-        <w:rPr>
-          <w:b/>
-          <w:bCs/>
-        </w:rPr>
         <w:t xml:space="preserve">Fictional examples:</w:t>
       </w:r>
       <w:r>
-        <w:t xml:space="preserve"> the "sch00l-portal-login.net" email and the "You WON a FREE PHONE" pop-up in the game are made-up examples created to teach phishing awareness.</w:t>
+        <w:t xml:space="preserve"> the "You WON a FREE PHONE" pop-up, the sari-sari store receipt, and all characters in the game are made up for this story.</w:t>
       </w:r>
     </w:p>
     <w:p>
@@ -17526,7 +17513,7 @@
                 <wp:inline distT="0" distB="0" distL="0" distR="0">
                   <wp:extent cx="2743200" cy="1543050"/>
                   <wp:effectExtent t="0" r="0" b="0" l="0"/>
-                  <wp:docPr id="1" name="q_s2q1_3.jpg" descr="Sector 2: Legit or Phishing?" title="Sector 2: Legit or Phishing?"/>
+                  <wp:docPr id="1" name="q_s1q2_3.jpg" descr="Sector 1: Fact or Myth?" title="Sector 1: Fact or Myth?"/>
                   <wp:cNvGraphicFramePr>
                     <a:graphicFrameLocks xmlns:a="http://schemas.openxmlformats.org/drawingml/2006/main" noChangeAspect="1"/>
                   </wp:cNvGraphicFramePr>
@@ -17576,7 +17563,7 @@
               </w:r>
             </w:fldSimple>
             <w:r>
-              <w:t xml:space="preserve">. Sector 2: Legit or Phishing?</w:t>
+              <w:t xml:space="preserve">. Sector 1: Fact or Myth?</w:t>
             </w:r>
           </w:p>
         </w:tc>
@@ -17599,7 +17586,7 @@
                 <wp:inline distT="0" distB="0" distL="0" distR="0">
                   <wp:extent cx="2743200" cy="1543050"/>
                   <wp:effectExtent t="0" r="0" b="0" l="0"/>
-                  <wp:docPr id="1" name="q_s3q2_3.jpg" descr="Sector 3: the spreadsheet puzzle." title="Sector 3: the spreadsheet puzzle."/>
+                  <wp:docPr id="1" name="q_s3q2_3.jpg" descr="Sector 3: the sari-sari store receipt puzzle." title="Sector 3: the sari-sari store receipt puzzle."/>
                   <wp:cNvGraphicFramePr>
                     <a:graphicFrameLocks xmlns:a="http://schemas.openxmlformats.org/drawingml/2006/main" noChangeAspect="1"/>
                   </wp:cNvGraphicFramePr>
@@ -17649,7 +17636,7 @@
               </w:r>
             </w:fldSimple>
             <w:r>
-              <w:t xml:space="preserve">. Sector 3: the spreadsheet puzzle.</w:t>
+              <w:t xml:space="preserve">. Sector 3: the sari-sari store receipt puzzle.</w:t>
             </w:r>
           </w:p>
         </w:tc>

</xml_diff>

<commit_message>
Fill in Group 5 team details, work plan dates and reflections
Co-Authored-By: Claude Opus 5.5 <noreply@anthropic.com>
Claude-Session: https://claude.ai/code/session_015Anyb9rTrTM848P791HGtW
</commit_message>
<xml_diff>
--- a/gamecraft-ctrl-escape/CTRL-ESCAPE_Game_Documentation.docx
+++ b/gamecraft-ctrl-escape/CTRL-ESCAPE_Game_Documentation.docx
@@ -170,7 +170,7 @@
                 <w:bCs/>
                 <w:color w:val="1A2353"/>
               </w:rPr>
-              <w:t xml:space="preserve">Group Name</w:t>
+              <w:t xml:space="preserve">Group</w:t>
             </w:r>
           </w:p>
         </w:tc>
@@ -194,7 +194,7 @@
                 <w:b w:val="false"/>
                 <w:bCs w:val="false"/>
               </w:rPr>
-              <w:t xml:space="preserve">[Group Name]</w:t>
+              <w:t xml:space="preserve">Group 5</w:t>
             </w:r>
           </w:p>
         </w:tc>
@@ -247,46 +247,93 @@
             </w:pPr>
             <w:r>
               <w:rPr>
+                <w:b/>
+                <w:bCs/>
+              </w:rPr>
+              <w:t xml:space="preserve">Nathan Sean Dueñas</w:t>
+            </w:r>
+            <w:r>
+              <w:rPr>
                 <w:b w:val="false"/>
                 <w:bCs w:val="false"/>
               </w:rPr>
-              <w:t xml:space="preserve">[Member Name] - Game Designer</w:t>
-            </w:r>
-          </w:p>
-          <w:p>
-            <w:pPr>
-              <w:spacing w:after="40" w:line="264"/>
-            </w:pPr>
+              <w:t xml:space="preserve">  (Game Designer)</w:t>
+            </w:r>
+          </w:p>
+          <w:p>
+            <w:pPr>
+              <w:spacing w:after="40" w:line="264"/>
+            </w:pPr>
+            <w:r>
+              <w:rPr>
+                <w:b/>
+                <w:bCs/>
+              </w:rPr>
+              <w:t xml:space="preserve">Denzel Red Bernardo</w:t>
+            </w:r>
             <w:r>
               <w:rPr>
                 <w:b w:val="false"/>
                 <w:bCs w:val="false"/>
               </w:rPr>
-              <w:t xml:space="preserve">[Member Name] - Story / Content Designer</w:t>
-            </w:r>
-          </w:p>
-          <w:p>
-            <w:pPr>
-              <w:spacing w:after="40" w:line="264"/>
-            </w:pPr>
+              <w:t xml:space="preserve">  (Story / Content Designer)</w:t>
+            </w:r>
+          </w:p>
+          <w:p>
+            <w:pPr>
+              <w:spacing w:after="40" w:line="264"/>
+            </w:pPr>
+            <w:r>
+              <w:rPr>
+                <w:b/>
+                <w:bCs/>
+              </w:rPr>
+              <w:t xml:space="preserve">Mykoh Ashton Lapeña</w:t>
+            </w:r>
             <w:r>
               <w:rPr>
                 <w:b w:val="false"/>
                 <w:bCs w:val="false"/>
               </w:rPr>
-              <w:t xml:space="preserve">[Member Name] - PowerPoint Developer</w:t>
-            </w:r>
-          </w:p>
-          <w:p>
-            <w:pPr>
-              <w:spacing w:after="40" w:line="264"/>
-            </w:pPr>
+              <w:t xml:space="preserve">  (Story / Content Designer)</w:t>
+            </w:r>
+          </w:p>
+          <w:p>
+            <w:pPr>
+              <w:spacing w:after="40" w:line="264"/>
+            </w:pPr>
+            <w:r>
+              <w:rPr>
+                <w:b/>
+                <w:bCs/>
+              </w:rPr>
+              <w:t xml:space="preserve">Inigo Abrahano</w:t>
+            </w:r>
             <w:r>
               <w:rPr>
                 <w:b w:val="false"/>
                 <w:bCs w:val="false"/>
               </w:rPr>
-              <w:t xml:space="preserve">[Member Name] - Tester / Documentation Lead</w:t>
+              <w:t xml:space="preserve">  (PowerPoint Developer)</w:t>
+            </w:r>
+          </w:p>
+          <w:p>
+            <w:pPr>
+              <w:spacing w:after="40" w:line="264"/>
+            </w:pPr>
+            <w:r>
+              <w:rPr>
+                <w:b/>
+                <w:bCs/>
+              </w:rPr>
+              <w:t xml:space="preserve">Prince Angelo Barcelona</w:t>
+            </w:r>
+            <w:r>
+              <w:rPr>
+                <w:b w:val="false"/>
+                <w:bCs w:val="false"/>
+              </w:rPr>
+              <w:t xml:space="preserve">  (Tester / Documentation Lead)</w:t>
             </w:r>
           </w:p>
         </w:tc>
@@ -340,7 +387,7 @@
                 <w:b w:val="false"/>
                 <w:bCs w:val="false"/>
               </w:rPr>
-              <w:t xml:space="preserve">[Grade &amp; Section]</w:t>
+              <w:t xml:space="preserve">12BE-15</w:t>
             </w:r>
           </w:p>
         </w:tc>
@@ -396,7 +443,7 @@
                 <w:b w:val="false"/>
                 <w:bCs w:val="false"/>
               </w:rPr>
-              <w:t xml:space="preserve">[Teacher's Name]</w:t>
+              <w:t xml:space="preserve">Monette M. Bautista</w:t>
             </w:r>
           </w:p>
         </w:tc>
@@ -450,7 +497,7 @@
                 <w:b w:val="false"/>
                 <w:bCs w:val="false"/>
               </w:rPr>
-              <w:t xml:space="preserve">[Date]</w:t>
+              <w:t xml:space="preserve">October 2, 2026</w:t>
             </w:r>
           </w:p>
         </w:tc>
@@ -562,7 +609,7 @@
         </w:rPr>
         <w:t xml:space="preserve">Play the game: </w:t>
       </w:r>
-      <w:hyperlink w:history="1" r:id="rIddl9pepgkaomm8c5pdh8td">
+      <w:hyperlink w:history="1" r:id="rIdzcrelrt0g6fcrg6nnkvgm">
         <w:r>
           <w:rPr>
             <w:rStyle w:val="Hyperlink"/>
@@ -1278,10 +1325,10 @@
         </w:tblBorders>
       </w:tblPr>
       <w:tblGrid>
-        <w:gridCol w:w="2100"/>
-        <w:gridCol w:w="1900"/>
-        <w:gridCol w:w="3460"/>
-        <w:gridCol w:w="1900"/>
+        <w:gridCol w:w="2000"/>
+        <w:gridCol w:w="2200"/>
+        <w:gridCol w:w="3360"/>
+        <w:gridCol w:w="1800"/>
       </w:tblGrid>
       <w:tr>
         <w:trPr>
@@ -1290,7 +1337,7 @@
         </w:trPr>
         <w:tc>
           <w:tcPr>
-            <w:tcW w:type="dxa" w:w="2100"/>
+            <w:tcW w:type="dxa" w:w="2000"/>
             <w:shd w:fill="1A2353" w:color="auto" w:val="clear"/>
             <w:tcMar>
               <w:top w:type="dxa" w:w="80"/>
@@ -1316,7 +1363,7 @@
         </w:tc>
         <w:tc>
           <w:tcPr>
-            <w:tcW w:type="dxa" w:w="1900"/>
+            <w:tcW w:type="dxa" w:w="2200"/>
             <w:shd w:fill="1A2353" w:color="auto" w:val="clear"/>
             <w:tcMar>
               <w:top w:type="dxa" w:w="80"/>
@@ -1342,7 +1389,7 @@
         </w:tc>
         <w:tc>
           <w:tcPr>
-            <w:tcW w:type="dxa" w:w="3460"/>
+            <w:tcW w:type="dxa" w:w="3360"/>
             <w:shd w:fill="1A2353" w:color="auto" w:val="clear"/>
             <w:tcMar>
               <w:top w:type="dxa" w:w="80"/>
@@ -1368,7 +1415,7 @@
         </w:tc>
         <w:tc>
           <w:tcPr>
-            <w:tcW w:type="dxa" w:w="1900"/>
+            <w:tcW w:type="dxa" w:w="1800"/>
             <w:shd w:fill="1A2353" w:color="auto" w:val="clear"/>
             <w:tcMar>
               <w:top w:type="dxa" w:w="80"/>
@@ -1399,7 +1446,7 @@
         </w:trPr>
         <w:tc>
           <w:tcPr>
-            <w:tcW w:type="dxa" w:w="2100"/>
+            <w:tcW w:type="dxa" w:w="2000"/>
             <w:tcMar>
               <w:top w:type="dxa" w:w="80"/>
               <w:left w:type="dxa" w:w="120"/>
@@ -1424,7 +1471,7 @@
         </w:tc>
         <w:tc>
           <w:tcPr>
-            <w:tcW w:type="dxa" w:w="1900"/>
+            <w:tcW w:type="dxa" w:w="2200"/>
             <w:tcMar>
               <w:top w:type="dxa" w:w="80"/>
               <w:left w:type="dxa" w:w="120"/>
@@ -1442,13 +1489,13 @@
                 <w:b w:val="false"/>
                 <w:bCs w:val="false"/>
               </w:rPr>
-              <w:t xml:space="preserve">[Member Name]</w:t>
-            </w:r>
-          </w:p>
-        </w:tc>
-        <w:tc>
-          <w:tcPr>
-            <w:tcW w:type="dxa" w:w="3460"/>
+              <w:t xml:space="preserve">Nathan Sean Dueñas</w:t>
+            </w:r>
+          </w:p>
+        </w:tc>
+        <w:tc>
+          <w:tcPr>
+            <w:tcW w:type="dxa" w:w="3360"/>
             <w:tcMar>
               <w:top w:type="dxa" w:w="80"/>
               <w:left w:type="dxa" w:w="120"/>
@@ -1472,7 +1519,7 @@
         </w:tc>
         <w:tc>
           <w:tcPr>
-            <w:tcW w:type="dxa" w:w="1900"/>
+            <w:tcW w:type="dxa" w:w="1800"/>
             <w:tcMar>
               <w:top w:type="dxa" w:w="80"/>
               <w:left w:type="dxa" w:w="120"/>
@@ -1501,7 +1548,7 @@
         </w:trPr>
         <w:tc>
           <w:tcPr>
-            <w:tcW w:type="dxa" w:w="2100"/>
+            <w:tcW w:type="dxa" w:w="2000"/>
             <w:shd w:fill="F3F6FF" w:color="auto" w:val="clear"/>
             <w:tcMar>
               <w:top w:type="dxa" w:w="80"/>
@@ -1521,13 +1568,13 @@
                 <w:bCs/>
                 <w:color w:val="1A2353"/>
               </w:rPr>
-              <w:t xml:space="preserve">Story / Content Designer</w:t>
-            </w:r>
-          </w:p>
-        </w:tc>
-        <w:tc>
-          <w:tcPr>
-            <w:tcW w:type="dxa" w:w="1900"/>
+              <w:t xml:space="preserve">Story / Content Designers</w:t>
+            </w:r>
+          </w:p>
+        </w:tc>
+        <w:tc>
+          <w:tcPr>
+            <w:tcW w:type="dxa" w:w="2200"/>
             <w:shd w:fill="F3F6FF" w:color="auto" w:val="clear"/>
             <w:tcMar>
               <w:top w:type="dxa" w:w="80"/>
@@ -1546,22 +1593,9 @@
                 <w:b w:val="false"/>
                 <w:bCs w:val="false"/>
               </w:rPr>
-              <w:t xml:space="preserve">[Member Name]</w:t>
-            </w:r>
-          </w:p>
-        </w:tc>
-        <w:tc>
-          <w:tcPr>
-            <w:tcW w:type="dxa" w:w="3460"/>
-            <w:shd w:fill="F3F6FF" w:color="auto" w:val="clear"/>
-            <w:tcMar>
-              <w:top w:type="dxa" w:w="80"/>
-              <w:left w:type="dxa" w:w="120"/>
-              <w:bottom w:type="dxa" w:w="80"/>
-              <w:right w:type="dxa" w:w="120"/>
-            </w:tcMar>
-            <w:vAlign w:val="center"/>
-          </w:tcPr>
+              <w:t xml:space="preserve">Denzel Red Bernardo</w:t>
+            </w:r>
+          </w:p>
           <w:p>
             <w:pPr>
               <w:spacing w:after="40" w:line="264"/>
@@ -1571,13 +1605,38 @@
                 <w:b w:val="false"/>
                 <w:bCs w:val="false"/>
               </w:rPr>
+              <w:t xml:space="preserve">Mykoh Ashton Lapeña</w:t>
+            </w:r>
+          </w:p>
+        </w:tc>
+        <w:tc>
+          <w:tcPr>
+            <w:tcW w:type="dxa" w:w="3360"/>
+            <w:shd w:fill="F3F6FF" w:color="auto" w:val="clear"/>
+            <w:tcMar>
+              <w:top w:type="dxa" w:w="80"/>
+              <w:left w:type="dxa" w:w="120"/>
+              <w:bottom w:type="dxa" w:w="80"/>
+              <w:right w:type="dxa" w:w="120"/>
+            </w:tcMar>
+            <w:vAlign w:val="center"/>
+          </w:tcPr>
+          <w:p>
+            <w:pPr>
+              <w:spacing w:after="40" w:line="264"/>
+            </w:pPr>
+            <w:r>
+              <w:rPr>
+                <w:b w:val="false"/>
+                <w:bCs w:val="false"/>
+              </w:rPr>
               <w:t xml:space="preserve">Wrote the backstory, characters, dialogue, questions, hints, and explanations</w:t>
             </w:r>
           </w:p>
         </w:tc>
         <w:tc>
           <w:tcPr>
-            <w:tcW w:type="dxa" w:w="1900"/>
+            <w:tcW w:type="dxa" w:w="1800"/>
             <w:shd w:fill="F3F6FF" w:color="auto" w:val="clear"/>
             <w:tcMar>
               <w:top w:type="dxa" w:w="80"/>
@@ -1607,7 +1666,7 @@
         </w:trPr>
         <w:tc>
           <w:tcPr>
-            <w:tcW w:type="dxa" w:w="2100"/>
+            <w:tcW w:type="dxa" w:w="2000"/>
             <w:tcMar>
               <w:top w:type="dxa" w:w="80"/>
               <w:left w:type="dxa" w:w="120"/>
@@ -1632,7 +1691,7 @@
         </w:tc>
         <w:tc>
           <w:tcPr>
-            <w:tcW w:type="dxa" w:w="1900"/>
+            <w:tcW w:type="dxa" w:w="2200"/>
             <w:tcMar>
               <w:top w:type="dxa" w:w="80"/>
               <w:left w:type="dxa" w:w="120"/>
@@ -1650,13 +1709,13 @@
                 <w:b w:val="false"/>
                 <w:bCs w:val="false"/>
               </w:rPr>
-              <w:t xml:space="preserve">[Member Name]</w:t>
-            </w:r>
-          </w:p>
-        </w:tc>
-        <w:tc>
-          <w:tcPr>
-            <w:tcW w:type="dxa" w:w="3460"/>
+              <w:t xml:space="preserve">Inigo Abrahano</w:t>
+            </w:r>
+          </w:p>
+        </w:tc>
+        <w:tc>
+          <w:tcPr>
+            <w:tcW w:type="dxa" w:w="3360"/>
             <w:tcMar>
               <w:top w:type="dxa" w:w="80"/>
               <w:left w:type="dxa" w:w="120"/>
@@ -1680,7 +1739,7 @@
         </w:tc>
         <w:tc>
           <w:tcPr>
-            <w:tcW w:type="dxa" w:w="1900"/>
+            <w:tcW w:type="dxa" w:w="1800"/>
             <w:tcMar>
               <w:top w:type="dxa" w:w="80"/>
               <w:left w:type="dxa" w:w="120"/>
@@ -1709,7 +1768,7 @@
         </w:trPr>
         <w:tc>
           <w:tcPr>
-            <w:tcW w:type="dxa" w:w="2100"/>
+            <w:tcW w:type="dxa" w:w="2000"/>
             <w:shd w:fill="F3F6FF" w:color="auto" w:val="clear"/>
             <w:tcMar>
               <w:top w:type="dxa" w:w="80"/>
@@ -1735,7 +1794,7 @@
         </w:tc>
         <w:tc>
           <w:tcPr>
-            <w:tcW w:type="dxa" w:w="1900"/>
+            <w:tcW w:type="dxa" w:w="2200"/>
             <w:shd w:fill="F3F6FF" w:color="auto" w:val="clear"/>
             <w:tcMar>
               <w:top w:type="dxa" w:w="80"/>
@@ -1754,13 +1813,13 @@
                 <w:b w:val="false"/>
                 <w:bCs w:val="false"/>
               </w:rPr>
-              <w:t xml:space="preserve">[Member Name]</w:t>
-            </w:r>
-          </w:p>
-        </w:tc>
-        <w:tc>
-          <w:tcPr>
-            <w:tcW w:type="dxa" w:w="3460"/>
+              <w:t xml:space="preserve">Prince Angelo Barcelona</w:t>
+            </w:r>
+          </w:p>
+        </w:tc>
+        <w:tc>
+          <w:tcPr>
+            <w:tcW w:type="dxa" w:w="3360"/>
             <w:shd w:fill="F3F6FF" w:color="auto" w:val="clear"/>
             <w:tcMar>
               <w:top w:type="dxa" w:w="80"/>
@@ -1785,7 +1844,7 @@
         </w:tc>
         <w:tc>
           <w:tcPr>
-            <w:tcW w:type="dxa" w:w="1900"/>
+            <w:tcW w:type="dxa" w:w="1800"/>
             <w:shd w:fill="F3F6FF" w:color="auto" w:val="clear"/>
             <w:tcMar>
               <w:top w:type="dxa" w:w="80"/>
@@ -1810,19 +1869,6 @@
         </w:tc>
       </w:tr>
     </w:tbl>
-    <w:p>
-      <w:pPr>
-        <w:spacing w:after="120" w:line="288"/>
-      </w:pPr>
-      <w:r>
-        <w:rPr>
-          <w:i/>
-          <w:iCs/>
-          <w:color w:val="5B6382"/>
-        </w:rPr>
-        <w:t xml:space="preserve">[Add a row for each additional group member.]</w:t>
-      </w:r>
-    </w:p>
     <w:p>
       <w:pPr>
         <w:pStyle w:val="Heading1"/>
@@ -14113,10 +14159,10 @@
         </w:tblBorders>
       </w:tblPr>
       <w:tblGrid>
-        <w:gridCol w:w="2000"/>
-        <w:gridCol w:w="4060"/>
-        <w:gridCol w:w="2100"/>
-        <w:gridCol w:w="1200"/>
+        <w:gridCol w:w="1700"/>
+        <w:gridCol w:w="3460"/>
+        <w:gridCol w:w="2300"/>
+        <w:gridCol w:w="1900"/>
       </w:tblGrid>
       <w:tr>
         <w:trPr>
@@ -14125,7 +14171,7 @@
         </w:trPr>
         <w:tc>
           <w:tcPr>
-            <w:tcW w:type="dxa" w:w="2000"/>
+            <w:tcW w:type="dxa" w:w="1700"/>
             <w:shd w:fill="1A2353" w:color="auto" w:val="clear"/>
             <w:tcMar>
               <w:top w:type="dxa" w:w="80"/>
@@ -14151,7 +14197,7 @@
         </w:tc>
         <w:tc>
           <w:tcPr>
-            <w:tcW w:type="dxa" w:w="4060"/>
+            <w:tcW w:type="dxa" w:w="3460"/>
             <w:shd w:fill="1A2353" w:color="auto" w:val="clear"/>
             <w:tcMar>
               <w:top w:type="dxa" w:w="80"/>
@@ -14177,7 +14223,7 @@
         </w:tc>
         <w:tc>
           <w:tcPr>
-            <w:tcW w:type="dxa" w:w="2100"/>
+            <w:tcW w:type="dxa" w:w="2300"/>
             <w:shd w:fill="1A2353" w:color="auto" w:val="clear"/>
             <w:tcMar>
               <w:top w:type="dxa" w:w="80"/>
@@ -14203,7 +14249,7 @@
         </w:tc>
         <w:tc>
           <w:tcPr>
-            <w:tcW w:type="dxa" w:w="1200"/>
+            <w:tcW w:type="dxa" w:w="1900"/>
             <w:shd w:fill="1A2353" w:color="auto" w:val="clear"/>
             <w:tcMar>
               <w:top w:type="dxa" w:w="80"/>
@@ -14223,7 +14269,7 @@
                 <w:bCs/>
                 <w:color w:val="FFFFFF"/>
               </w:rPr>
-              <w:t xml:space="preserve">Target Date</w:t>
+              <w:t xml:space="preserve">Date</w:t>
             </w:r>
           </w:p>
         </w:tc>
@@ -14234,7 +14280,7 @@
         </w:trPr>
         <w:tc>
           <w:tcPr>
-            <w:tcW w:type="dxa" w:w="2000"/>
+            <w:tcW w:type="dxa" w:w="1700"/>
             <w:tcMar>
               <w:top w:type="dxa" w:w="80"/>
               <w:left w:type="dxa" w:w="120"/>
@@ -14259,7 +14305,7 @@
         </w:tc>
         <w:tc>
           <w:tcPr>
-            <w:tcW w:type="dxa" w:w="4060"/>
+            <w:tcW w:type="dxa" w:w="3460"/>
             <w:tcMar>
               <w:top w:type="dxa" w:w="80"/>
               <w:left w:type="dxa" w:w="120"/>
@@ -14283,7 +14329,7 @@
         </w:tc>
         <w:tc>
           <w:tcPr>
-            <w:tcW w:type="dxa" w:w="2100"/>
+            <w:tcW w:type="dxa" w:w="2300"/>
             <w:tcMar>
               <w:top w:type="dxa" w:w="80"/>
               <w:left w:type="dxa" w:w="120"/>
@@ -14301,13 +14347,13 @@
                 <w:b w:val="false"/>
                 <w:bCs w:val="false"/>
               </w:rPr>
-              <w:t xml:space="preserve">Game Designer</w:t>
-            </w:r>
-          </w:p>
-        </w:tc>
-        <w:tc>
-          <w:tcPr>
-            <w:tcW w:type="dxa" w:w="1200"/>
+              <w:t xml:space="preserve">Nathan Sean Dueñas</w:t>
+            </w:r>
+          </w:p>
+        </w:tc>
+        <w:tc>
+          <w:tcPr>
+            <w:tcW w:type="dxa" w:w="1900"/>
             <w:tcMar>
               <w:top w:type="dxa" w:w="80"/>
               <w:left w:type="dxa" w:w="120"/>
@@ -14325,7 +14371,7 @@
                 <w:b w:val="false"/>
                 <w:bCs w:val="false"/>
               </w:rPr>
-              <w:t xml:space="preserve">[Date]</w:t>
+              <w:t xml:space="preserve">September 21, 2026</w:t>
             </w:r>
           </w:p>
         </w:tc>
@@ -14336,7 +14382,7 @@
         </w:trPr>
         <w:tc>
           <w:tcPr>
-            <w:tcW w:type="dxa" w:w="2000"/>
+            <w:tcW w:type="dxa" w:w="1700"/>
             <w:shd w:fill="F3F6FF" w:color="auto" w:val="clear"/>
             <w:tcMar>
               <w:top w:type="dxa" w:w="80"/>
@@ -14362,7 +14408,7 @@
         </w:tc>
         <w:tc>
           <w:tcPr>
-            <w:tcW w:type="dxa" w:w="4060"/>
+            <w:tcW w:type="dxa" w:w="3460"/>
             <w:shd w:fill="F3F6FF" w:color="auto" w:val="clear"/>
             <w:tcMar>
               <w:top w:type="dxa" w:w="80"/>
@@ -14387,7 +14433,7 @@
         </w:tc>
         <w:tc>
           <w:tcPr>
-            <w:tcW w:type="dxa" w:w="2100"/>
+            <w:tcW w:type="dxa" w:w="2300"/>
             <w:shd w:fill="F3F6FF" w:color="auto" w:val="clear"/>
             <w:tcMar>
               <w:top w:type="dxa" w:w="80"/>
@@ -14406,13 +14452,13 @@
                 <w:b w:val="false"/>
                 <w:bCs w:val="false"/>
               </w:rPr>
-              <w:t xml:space="preserve">Story / Content Designer</w:t>
-            </w:r>
-          </w:p>
-        </w:tc>
-        <w:tc>
-          <w:tcPr>
-            <w:tcW w:type="dxa" w:w="1200"/>
+              <w:t xml:space="preserve">Denzel Red Bernardo, Mykoh Ashton Lapeña</w:t>
+            </w:r>
+          </w:p>
+        </w:tc>
+        <w:tc>
+          <w:tcPr>
+            <w:tcW w:type="dxa" w:w="1900"/>
             <w:shd w:fill="F3F6FF" w:color="auto" w:val="clear"/>
             <w:tcMar>
               <w:top w:type="dxa" w:w="80"/>
@@ -14431,7 +14477,7 @@
                 <w:b w:val="false"/>
                 <w:bCs w:val="false"/>
               </w:rPr>
-              <w:t xml:space="preserve">[Date]</w:t>
+              <w:t xml:space="preserve">September 22–23, 2026</w:t>
             </w:r>
           </w:p>
         </w:tc>
@@ -14442,7 +14488,7 @@
         </w:trPr>
         <w:tc>
           <w:tcPr>
-            <w:tcW w:type="dxa" w:w="2000"/>
+            <w:tcW w:type="dxa" w:w="1700"/>
             <w:tcMar>
               <w:top w:type="dxa" w:w="80"/>
               <w:left w:type="dxa" w:w="120"/>
@@ -14467,7 +14513,7 @@
         </w:tc>
         <w:tc>
           <w:tcPr>
-            <w:tcW w:type="dxa" w:w="4060"/>
+            <w:tcW w:type="dxa" w:w="3460"/>
             <w:tcMar>
               <w:top w:type="dxa" w:w="80"/>
               <w:left w:type="dxa" w:w="120"/>
@@ -14491,7 +14537,7 @@
         </w:tc>
         <w:tc>
           <w:tcPr>
-            <w:tcW w:type="dxa" w:w="2100"/>
+            <w:tcW w:type="dxa" w:w="2300"/>
             <w:tcMar>
               <w:top w:type="dxa" w:w="80"/>
               <w:left w:type="dxa" w:w="120"/>
@@ -14509,13 +14555,13 @@
                 <w:b w:val="false"/>
                 <w:bCs w:val="false"/>
               </w:rPr>
-              <w:t xml:space="preserve">Game Designer</w:t>
-            </w:r>
-          </w:p>
-        </w:tc>
-        <w:tc>
-          <w:tcPr>
-            <w:tcW w:type="dxa" w:w="1200"/>
+              <w:t xml:space="preserve">Nathan Sean Dueñas</w:t>
+            </w:r>
+          </w:p>
+        </w:tc>
+        <w:tc>
+          <w:tcPr>
+            <w:tcW w:type="dxa" w:w="1900"/>
             <w:tcMar>
               <w:top w:type="dxa" w:w="80"/>
               <w:left w:type="dxa" w:w="120"/>
@@ -14533,7 +14579,7 @@
                 <w:b w:val="false"/>
                 <w:bCs w:val="false"/>
               </w:rPr>
-              <w:t xml:space="preserve">[Date]</w:t>
+              <w:t xml:space="preserve">September 24–25, 2026</w:t>
             </w:r>
           </w:p>
         </w:tc>
@@ -14544,7 +14590,7 @@
         </w:trPr>
         <w:tc>
           <w:tcPr>
-            <w:tcW w:type="dxa" w:w="2000"/>
+            <w:tcW w:type="dxa" w:w="1700"/>
             <w:shd w:fill="F3F6FF" w:color="auto" w:val="clear"/>
             <w:tcMar>
               <w:top w:type="dxa" w:w="80"/>
@@ -14570,7 +14616,7 @@
         </w:tc>
         <w:tc>
           <w:tcPr>
-            <w:tcW w:type="dxa" w:w="4060"/>
+            <w:tcW w:type="dxa" w:w="3460"/>
             <w:shd w:fill="F3F6FF" w:color="auto" w:val="clear"/>
             <w:tcMar>
               <w:top w:type="dxa" w:w="80"/>
@@ -14595,7 +14641,7 @@
         </w:tc>
         <w:tc>
           <w:tcPr>
-            <w:tcW w:type="dxa" w:w="2100"/>
+            <w:tcW w:type="dxa" w:w="2300"/>
             <w:shd w:fill="F3F6FF" w:color="auto" w:val="clear"/>
             <w:tcMar>
               <w:top w:type="dxa" w:w="80"/>
@@ -14614,13 +14660,13 @@
                 <w:b w:val="false"/>
                 <w:bCs w:val="false"/>
               </w:rPr>
-              <w:t xml:space="preserve">PowerPoint Developer</w:t>
-            </w:r>
-          </w:p>
-        </w:tc>
-        <w:tc>
-          <w:tcPr>
-            <w:tcW w:type="dxa" w:w="1200"/>
+              <w:t xml:space="preserve">Inigo Abrahano</w:t>
+            </w:r>
+          </w:p>
+        </w:tc>
+        <w:tc>
+          <w:tcPr>
+            <w:tcW w:type="dxa" w:w="1900"/>
             <w:shd w:fill="F3F6FF" w:color="auto" w:val="clear"/>
             <w:tcMar>
               <w:top w:type="dxa" w:w="80"/>
@@ -14639,7 +14685,7 @@
                 <w:b w:val="false"/>
                 <w:bCs w:val="false"/>
               </w:rPr>
-              <w:t xml:space="preserve">[Date]</w:t>
+              <w:t xml:space="preserve">September 26–28, 2026</w:t>
             </w:r>
           </w:p>
         </w:tc>
@@ -14650,7 +14696,7 @@
         </w:trPr>
         <w:tc>
           <w:tcPr>
-            <w:tcW w:type="dxa" w:w="2000"/>
+            <w:tcW w:type="dxa" w:w="1700"/>
             <w:tcMar>
               <w:top w:type="dxa" w:w="80"/>
               <w:left w:type="dxa" w:w="120"/>
@@ -14675,7 +14721,7 @@
         </w:tc>
         <w:tc>
           <w:tcPr>
-            <w:tcW w:type="dxa" w:w="4060"/>
+            <w:tcW w:type="dxa" w:w="3460"/>
             <w:tcMar>
               <w:top w:type="dxa" w:w="80"/>
               <w:left w:type="dxa" w:w="120"/>
@@ -14699,7 +14745,7 @@
         </w:tc>
         <w:tc>
           <w:tcPr>
-            <w:tcW w:type="dxa" w:w="2100"/>
+            <w:tcW w:type="dxa" w:w="2300"/>
             <w:tcMar>
               <w:top w:type="dxa" w:w="80"/>
               <w:left w:type="dxa" w:w="120"/>
@@ -14717,13 +14763,13 @@
                 <w:b w:val="false"/>
                 <w:bCs w:val="false"/>
               </w:rPr>
-              <w:t xml:space="preserve">Tester / Documentation Lead</w:t>
-            </w:r>
-          </w:p>
-        </w:tc>
-        <w:tc>
-          <w:tcPr>
-            <w:tcW w:type="dxa" w:w="1200"/>
+              <w:t xml:space="preserve">Prince Angelo Barcelona</w:t>
+            </w:r>
+          </w:p>
+        </w:tc>
+        <w:tc>
+          <w:tcPr>
+            <w:tcW w:type="dxa" w:w="1900"/>
             <w:tcMar>
               <w:top w:type="dxa" w:w="80"/>
               <w:left w:type="dxa" w:w="120"/>
@@ -14741,7 +14787,7 @@
                 <w:b w:val="false"/>
                 <w:bCs w:val="false"/>
               </w:rPr>
-              <w:t xml:space="preserve">[Date]</w:t>
+              <w:t xml:space="preserve">September 29, 2026</w:t>
             </w:r>
           </w:p>
         </w:tc>
@@ -14752,7 +14798,7 @@
         </w:trPr>
         <w:tc>
           <w:tcPr>
-            <w:tcW w:type="dxa" w:w="2000"/>
+            <w:tcW w:type="dxa" w:w="1700"/>
             <w:shd w:fill="F3F6FF" w:color="auto" w:val="clear"/>
             <w:tcMar>
               <w:top w:type="dxa" w:w="80"/>
@@ -14778,7 +14824,7 @@
         </w:tc>
         <w:tc>
           <w:tcPr>
-            <w:tcW w:type="dxa" w:w="4060"/>
+            <w:tcW w:type="dxa" w:w="3460"/>
             <w:shd w:fill="F3F6FF" w:color="auto" w:val="clear"/>
             <w:tcMar>
               <w:top w:type="dxa" w:w="80"/>
@@ -14803,7 +14849,7 @@
         </w:tc>
         <w:tc>
           <w:tcPr>
-            <w:tcW w:type="dxa" w:w="2100"/>
+            <w:tcW w:type="dxa" w:w="2300"/>
             <w:shd w:fill="F3F6FF" w:color="auto" w:val="clear"/>
             <w:tcMar>
               <w:top w:type="dxa" w:w="80"/>
@@ -14822,13 +14868,13 @@
                 <w:b w:val="false"/>
                 <w:bCs w:val="false"/>
               </w:rPr>
-              <w:t xml:space="preserve">Tester / Documentation Lead</w:t>
-            </w:r>
-          </w:p>
-        </w:tc>
-        <w:tc>
-          <w:tcPr>
-            <w:tcW w:type="dxa" w:w="1200"/>
+              <w:t xml:space="preserve">Prince Angelo Barcelona</w:t>
+            </w:r>
+          </w:p>
+        </w:tc>
+        <w:tc>
+          <w:tcPr>
+            <w:tcW w:type="dxa" w:w="1900"/>
             <w:shd w:fill="F3F6FF" w:color="auto" w:val="clear"/>
             <w:tcMar>
               <w:top w:type="dxa" w:w="80"/>
@@ -14847,7 +14893,7 @@
                 <w:b w:val="false"/>
                 <w:bCs w:val="false"/>
               </w:rPr>
-              <w:t xml:space="preserve">[Date]</w:t>
+              <w:t xml:space="preserve">September 30–October 1, 2026</w:t>
             </w:r>
           </w:p>
         </w:tc>
@@ -14858,7 +14904,7 @@
         </w:trPr>
         <w:tc>
           <w:tcPr>
-            <w:tcW w:type="dxa" w:w="2000"/>
+            <w:tcW w:type="dxa" w:w="1700"/>
             <w:tcMar>
               <w:top w:type="dxa" w:w="80"/>
               <w:left w:type="dxa" w:w="120"/>
@@ -14883,7 +14929,7 @@
         </w:tc>
         <w:tc>
           <w:tcPr>
-            <w:tcW w:type="dxa" w:w="4060"/>
+            <w:tcW w:type="dxa" w:w="3460"/>
             <w:tcMar>
               <w:top w:type="dxa" w:w="80"/>
               <w:left w:type="dxa" w:w="120"/>
@@ -14901,13 +14947,13 @@
                 <w:b w:val="false"/>
                 <w:bCs w:val="false"/>
               </w:rPr>
-              <w:t xml:space="preserve">Rehearse and present the game to the class</w:t>
-            </w:r>
-          </w:p>
-        </w:tc>
-        <w:tc>
-          <w:tcPr>
-            <w:tcW w:type="dxa" w:w="2100"/>
+              <w:t xml:space="preserve">Present the game to the class</w:t>
+            </w:r>
+          </w:p>
+        </w:tc>
+        <w:tc>
+          <w:tcPr>
+            <w:tcW w:type="dxa" w:w="2300"/>
             <w:tcMar>
               <w:top w:type="dxa" w:w="80"/>
               <w:left w:type="dxa" w:w="120"/>
@@ -14931,7 +14977,7 @@
         </w:tc>
         <w:tc>
           <w:tcPr>
-            <w:tcW w:type="dxa" w:w="1200"/>
+            <w:tcW w:type="dxa" w:w="1900"/>
             <w:tcMar>
               <w:top w:type="dxa" w:w="80"/>
               <w:left w:type="dxa" w:w="120"/>
@@ -14949,7 +14995,7 @@
                 <w:b w:val="false"/>
                 <w:bCs w:val="false"/>
               </w:rPr>
-              <w:t xml:space="preserve">[Date]</w:t>
+              <w:t xml:space="preserve">October 2, 2026</w:t>
             </w:r>
           </w:p>
         </w:tc>
@@ -16919,46 +16965,7 @@
         <w:spacing w:after="120" w:line="288"/>
       </w:pPr>
       <w:r>
-        <w:t xml:space="preserve">Each member answers these questions in 3 to 5 sentences:</w:t>
-      </w:r>
-    </w:p>
-    <w:p>
-      <w:pPr>
-        <w:pStyle w:val="ListParagraph"/>
-        <w:numPr>
-          <w:ilvl w:val="0"/>
-          <w:numId w:val="2"/>
-        </w:numPr>
-        <w:spacing w:after="80" w:line="276"/>
-      </w:pPr>
-      <w:r>
-        <w:t xml:space="preserve">What did you contribute to the game?</w:t>
-      </w:r>
-    </w:p>
-    <w:p>
-      <w:pPr>
-        <w:pStyle w:val="ListParagraph"/>
-        <w:numPr>
-          <w:ilvl w:val="0"/>
-          <w:numId w:val="2"/>
-        </w:numPr>
-        <w:spacing w:after="80" w:line="276"/>
-      </w:pPr>
-      <w:r>
-        <w:t xml:space="preserve">What was the hardest part, and how did you solve it?</w:t>
-      </w:r>
-    </w:p>
-    <w:p>
-      <w:pPr>
-        <w:pStyle w:val="ListParagraph"/>
-        <w:numPr>
-          <w:ilvl w:val="0"/>
-          <w:numId w:val="2"/>
-        </w:numPr>
-        <w:spacing w:after="80" w:line="276"/>
-      </w:pPr>
-      <w:r>
-        <w:t xml:space="preserve">What did you learn about using Word and PowerPoint as productivity tools?</w:t>
+        <w:t xml:space="preserve">Each member reflected on three questions: What did I contribute? What was the hardest part, and how did we solve it? What did I learn about using Word and PowerPoint as productivity tools?</w:t>
       </w:r>
     </w:p>
     <w:p>
@@ -16966,7 +16973,7 @@
         <w:pStyle w:val="Heading3"/>
       </w:pPr>
       <w:r>
-        <w:t xml:space="preserve">[Member Name], Game Designer</w:t>
+        <w:t xml:space="preserve">Nathan Sean Dueñas, Game Designer</w:t>
       </w:r>
     </w:p>
     <w:p>
@@ -16974,12 +16981,7 @@
         <w:spacing w:after="120" w:line="288"/>
       </w:pPr>
       <w:r>
-        <w:rPr>
-          <w:i/>
-          <w:iCs/>
-          <w:color w:val="5B6382"/>
-        </w:rPr>
-        <w:t xml:space="preserve">[Write your reflection here.]</w:t>
+        <w:t xml:space="preserve">I came up with the main idea of being trapped inside a computer and planned how the game works: the three shields, the Code Fragments, and the final code lock. The hardest part was figuring out how to keep track of shields, because PowerPoint cannot count lives without macros. We solved it by making a copy of every question for each number of shields, and drawing the flowchart first showed us exactly where every button had to go. I learned that planning the whole game on paper and in Word before building anything saves a lot of time and mistakes.</w:t>
       </w:r>
     </w:p>
     <w:p>
@@ -16987,7 +16989,7 @@
         <w:pStyle w:val="Heading3"/>
       </w:pPr>
       <w:r>
-        <w:t xml:space="preserve">[Member Name], Story / Content Designer</w:t>
+        <w:t xml:space="preserve">Denzel Red Bernardo, Story / Content Designer</w:t>
       </w:r>
     </w:p>
     <w:p>
@@ -16995,12 +16997,7 @@
         <w:spacing w:after="120" w:line="288"/>
       </w:pPr>
       <w:r>
-        <w:rPr>
-          <w:i/>
-          <w:iCs/>
-          <w:color w:val="5B6382"/>
-        </w:rPr>
-        <w:t xml:space="preserve">[Write your reflection here.]</w:t>
+        <w:t xml:space="preserve">I helped write the story of Kai, BYTE, and NULL, including the dialogue on the story slides and the sector briefings. It was hard to keep each part short enough to fit on a slide while still making it exciting. We read the lines out loud as a group and cut anything that did not move the story forward. I learned that a good story makes players care about answering the questions, and that organizing our dialogue in Word tables made it easy for everyone to review and edit.</w:t>
       </w:r>
     </w:p>
     <w:p>
@@ -17008,7 +17005,7 @@
         <w:pStyle w:val="Heading3"/>
       </w:pPr>
       <w:r>
-        <w:t xml:space="preserve">[Member Name], PowerPoint Developer</w:t>
+        <w:t xml:space="preserve">Mykoh Ashton Lapeña, Story / Content Designer</w:t>
       </w:r>
     </w:p>
     <w:p>
@@ -17016,12 +17013,7 @@
         <w:spacing w:after="120" w:line="288"/>
       </w:pPr>
       <w:r>
-        <w:rPr>
-          <w:i/>
-          <w:iCs/>
-          <w:color w:val="5B6382"/>
-        </w:rPr>
-        <w:t xml:space="preserve">[Write your reflection here.]</w:t>
+        <w:t xml:space="preserve">I wrote and checked the questions, hints, and explanations for all four sectors and NULL's Core. Our first set of questions was all about ICT, but we realized it would be too hard for players who are not into computers, so we changed everything to general knowledge that anyone can answer. The trickiest part was writing hints that help without giving away the answer, and making sure every fact was correct. I learned how important it is to think about who will play your game, and how a question bank in Word keeps the answers and explanations organized in one place.</w:t>
       </w:r>
     </w:p>
     <w:p>
@@ -17029,7 +17021,7 @@
         <w:pStyle w:val="Heading3"/>
       </w:pPr>
       <w:r>
-        <w:t xml:space="preserve">[Member Name], Tester / Documentation Lead</w:t>
+        <w:t xml:space="preserve">Inigo Abrahano, PowerPoint Developer</w:t>
       </w:r>
     </w:p>
     <w:p>
@@ -17037,12 +17029,7 @@
         <w:spacing w:after="120" w:line="288"/>
       </w:pPr>
       <w:r>
-        <w:rPr>
-          <w:i/>
-          <w:iCs/>
-          <w:color w:val="5B6382"/>
-        </w:rPr>
-        <w:t xml:space="preserve">[Write your reflection here.]</w:t>
+        <w:t xml:space="preserve">I built the game in PowerPoint, including the slide masters, buttons, hyperlinks, transitions, and sound effects. The hardest part was setting up more than 500 hyperlinks so that every button goes to the right slide, because a single wrong link can break the whole game. Grouping the slides into sections and labeling each one in the speaker notes made it much easier to find and fix problems. I learned that PowerPoint can do much more than presentations: with hyperlinks and action settings, it can become a real game.</w:t>
       </w:r>
     </w:p>
     <w:p>
@@ -17050,7 +17037,7 @@
         <w:pStyle w:val="Heading3"/>
       </w:pPr>
       <w:r>
-        <w:t xml:space="preserve">Group Reflection</w:t>
+        <w:t xml:space="preserve">Prince Angelo Barcelona, Tester / Documentation Lead</w:t>
       </w:r>
     </w:p>
     <w:p>
@@ -17058,12 +17045,23 @@
         <w:spacing w:after="120" w:line="288"/>
       </w:pPr>
       <w:r>
-        <w:rPr>
-          <w:i/>
-          <w:iCs/>
-          <w:color w:val="5B6382"/>
-        </w:rPr>
-        <w:t xml:space="preserve">[Write what your group learned from creating CTRL + ESCAPE together.]</w:t>
+        <w:t xml:space="preserve">My job was to test the game and put together this documentation. I played through different paths, like winning with different numbers of shields and losing on purpose to reach Game Over, and listed every problem so the team could fix it. Keeping this long document organized was a challenge, so I used styles, tables, captions, and a table of contents. I learned that testing is just as important as building, because players notice even the smallest mistake.</w:t>
+      </w:r>
+    </w:p>
+    <w:p>
+      <w:pPr>
+        <w:pStyle w:val="Heading3"/>
+      </w:pPr>
+      <w:r>
+        <w:t xml:space="preserve">Group Reflection</w:t>
+      </w:r>
+    </w:p>
+    <w:p>
+      <w:pPr>
+        <w:spacing w:after="120" w:line="288"/>
+      </w:pPr>
+      <w:r>
+        <w:t xml:space="preserve">Making CTRL + ESCAPE showed us that creating a game takes much more than a good idea. We had to plan, write, design, build, test, and document, and every step depended on the one before it. Dividing the work by role helped us finish on time, but we still helped each other at every stage, especially when we changed our questions and during testing. Most of all, we learned that Microsoft Word and PowerPoint are powerful productivity tools: Word helped us plan and stay organized, and PowerPoint let us turn that plan into a game people can actually play.</w:t>
       </w:r>
     </w:p>
     <w:p>

</xml_diff>